<commit_message>
docs: updated authority manager doc and added HP-001 Report
</commit_message>
<xml_diff>
--- a/docs/AI-Role-Specification/Authority_Manager_Agent_Specification.docx
+++ b/docs/AI-Role-Specification/Authority_Manager_Agent_Specification.docx
@@ -191,7 +191,21 @@
           <w:rFonts w:ascii="Aptos" w:eastAsia="Aptos" w:hAnsi="Aptos" w:cs="Aptos"/>
           <w:color w:val="000000" w:themeColor="text1"/>
         </w:rPr>
-        <w:t>10/09/2026</w:t>
+        <w:t>1</w:t>
+      </w:r>
+      <w:r>
+        <w:rPr>
+          <w:rFonts w:ascii="Aptos" w:eastAsia="Aptos" w:hAnsi="Aptos" w:cs="Aptos"/>
+          <w:color w:val="000000" w:themeColor="text1"/>
+        </w:rPr>
+        <w:t>6</w:t>
+      </w:r>
+      <w:r>
+        <w:rPr>
+          <w:rFonts w:ascii="Aptos" w:eastAsia="Aptos" w:hAnsi="Aptos" w:cs="Aptos"/>
+          <w:color w:val="000000" w:themeColor="text1"/>
+        </w:rPr>
+        <w:t>/09/2026</w:t>
       </w:r>
     </w:p>
     <w:p>
@@ -394,23 +408,14 @@
     </w:p>
     <w:p>
       <w:pPr>
-        <w:pStyle w:val="Heading2"/>
-        <w:spacing w:before="299" w:after="299"/>
-        <w:rPr>
-          <w:rFonts w:ascii="Aptos" w:eastAsia="Aptos" w:hAnsi="Aptos" w:cs="Aptos"/>
-          <w:sz w:val="36"/>
-          <w:szCs w:val="36"/>
-        </w:rPr>
-      </w:pPr>
-      <w:r>
-        <w:rPr>
-          <w:rFonts w:ascii="Aptos" w:eastAsia="Aptos" w:hAnsi="Aptos" w:cs="Aptos"/>
-          <w:b/>
-          <w:bCs/>
-          <w:sz w:val="36"/>
-          <w:szCs w:val="36"/>
-        </w:rPr>
-        <w:lastRenderedPageBreak/>
+        <w:pStyle w:val="Heading3"/>
+      </w:pPr>
+    </w:p>
+    <w:p>
+      <w:pPr>
+        <w:pStyle w:val="Heading3"/>
+      </w:pPr>
+      <w:r>
         <w:t>Key Responsibilities:</w:t>
       </w:r>
     </w:p>
@@ -457,23 +462,7 @@
           <w:rFonts w:ascii="Aptos" w:eastAsia="Aptos" w:hAnsi="Aptos" w:cs="Aptos"/>
           <w:color w:val="000000" w:themeColor="text1"/>
         </w:rPr>
-        <w:t xml:space="preserve">Continuously </w:t>
-      </w:r>
-      <w:proofErr w:type="gramStart"/>
-      <w:r>
-        <w:rPr>
-          <w:rFonts w:ascii="Aptos" w:eastAsia="Aptos" w:hAnsi="Aptos" w:cs="Aptos"/>
-          <w:color w:val="000000" w:themeColor="text1"/>
-        </w:rPr>
-        <w:t>improve</w:t>
-      </w:r>
-      <w:proofErr w:type="gramEnd"/>
-      <w:r>
-        <w:rPr>
-          <w:rFonts w:ascii="Aptos" w:eastAsia="Aptos" w:hAnsi="Aptos" w:cs="Aptos"/>
-          <w:color w:val="000000" w:themeColor="text1"/>
-        </w:rPr>
-        <w:t xml:space="preserve"> AI agent outputs and performances by identifying and rectifying issues, updating inputs and instructions, and maintaining an improvement backlog </w:t>
+        <w:t xml:space="preserve">Continuously improve AI agent outputs and performances by identifying and rectifying issues, updating inputs and instructions, and maintaining an improvement backlog </w:t>
       </w:r>
     </w:p>
     <w:p>
@@ -519,23 +508,7 @@
           <w:rFonts w:ascii="Aptos" w:eastAsia="Aptos" w:hAnsi="Aptos" w:cs="Aptos"/>
           <w:color w:val="000000" w:themeColor="text1"/>
         </w:rPr>
-        <w:t xml:space="preserve">Coordinate work, findings and recommendations between all AI agents in the team to ensure they will </w:t>
-      </w:r>
-      <w:proofErr w:type="gramStart"/>
-      <w:r>
-        <w:rPr>
-          <w:rFonts w:ascii="Aptos" w:eastAsia="Aptos" w:hAnsi="Aptos" w:cs="Aptos"/>
-          <w:color w:val="000000" w:themeColor="text1"/>
-        </w:rPr>
-        <w:t>in</w:t>
-      </w:r>
-      <w:proofErr w:type="gramEnd"/>
-      <w:r>
-        <w:rPr>
-          <w:rFonts w:ascii="Aptos" w:eastAsia="Aptos" w:hAnsi="Aptos" w:cs="Aptos"/>
-          <w:color w:val="000000" w:themeColor="text1"/>
-        </w:rPr>
-        <w:t xml:space="preserve"> combined team instead of operating independently</w:t>
+        <w:t>Coordinate work, findings and recommendations between all AI agents in the team to ensure they will in combined team instead of operating independently</w:t>
       </w:r>
     </w:p>
     <w:p>
@@ -566,10 +539,6 @@
         <w:pStyle w:val="ListParagraph"/>
         <w:keepNext/>
         <w:keepLines/>
-        <w:numPr>
-          <w:ilvl w:val="0"/>
-          <w:numId w:val="1"/>
-        </w:numPr>
         <w:spacing w:after="0" w:line="278" w:lineRule="auto"/>
         <w:rPr>
           <w:rFonts w:ascii="Aptos" w:eastAsia="Aptos" w:hAnsi="Aptos" w:cs="Aptos"/>
@@ -579,7 +548,6 @@
     </w:p>
     <w:p>
       <w:pPr>
-        <w:pStyle w:val="ListParagraph"/>
         <w:keepNext/>
         <w:keepLines/>
         <w:spacing w:after="0" w:line="278" w:lineRule="auto"/>
@@ -589,36 +557,7 @@
         </w:rPr>
       </w:pPr>
     </w:p>
-    <w:p>
-      <w:pPr>
-        <w:pStyle w:val="ListParagraph"/>
-        <w:keepNext/>
-        <w:keepLines/>
-        <w:spacing w:after="0" w:line="278" w:lineRule="auto"/>
-        <w:ind w:left="1080" w:hanging="360"/>
-        <w:rPr>
-          <w:rFonts w:ascii="Aptos" w:eastAsia="Aptos" w:hAnsi="Aptos" w:cs="Aptos"/>
-          <w:color w:val="000000" w:themeColor="text1"/>
-        </w:rPr>
-      </w:pPr>
-    </w:p>
-    <w:p>
-      <w:pPr>
-        <w:pStyle w:val="Heading3"/>
-        <w:spacing w:before="281" w:after="281"/>
-        <w:rPr>
-          <w:rFonts w:ascii="Aptos" w:eastAsia="Aptos" w:hAnsi="Aptos" w:cs="Aptos"/>
-          <w:color w:val="000000" w:themeColor="text1"/>
-          <w:sz w:val="24"/>
-          <w:szCs w:val="24"/>
-        </w:rPr>
-      </w:pPr>
-    </w:p>
-    <w:p>
-      <w:r>
-        <w:br w:type="page"/>
-      </w:r>
-    </w:p>
+    <w:p/>
     <w:p>
       <w:pPr>
         <w:pStyle w:val="Heading3"/>
@@ -877,21 +816,7 @@
               <w:rPr>
                 <w:rFonts w:ascii="Aptos" w:eastAsia="Aptos" w:hAnsi="Aptos" w:cs="Aptos"/>
               </w:rPr>
-              <w:t xml:space="preserve">Review each AI </w:t>
-            </w:r>
-            <w:proofErr w:type="gramStart"/>
-            <w:r>
-              <w:rPr>
-                <w:rFonts w:ascii="Aptos" w:eastAsia="Aptos" w:hAnsi="Aptos" w:cs="Aptos"/>
-              </w:rPr>
-              <w:t>agents</w:t>
-            </w:r>
-            <w:proofErr w:type="gramEnd"/>
-            <w:r>
-              <w:rPr>
-                <w:rFonts w:ascii="Aptos" w:eastAsia="Aptos" w:hAnsi="Aptos" w:cs="Aptos"/>
-              </w:rPr>
-              <w:t xml:space="preserve"> KPIs and record how many targets are achieved.  Their performance can be compared to each other to see which areas require improvement.</w:t>
+              <w:t>Review each AI agents KPIs and record how many targets are achieved.  Their performance can be compared to each other to see which areas require improvement.</w:t>
             </w:r>
           </w:p>
         </w:tc>
@@ -1012,24 +937,9 @@
               <w:rPr>
                 <w:rFonts w:ascii="Aptos" w:eastAsia="Aptos" w:hAnsi="Aptos" w:cs="Aptos"/>
               </w:rPr>
-              <w:t xml:space="preserve">Check if AI </w:t>
-            </w:r>
-            <w:proofErr w:type="gramStart"/>
-            <w:r>
-              <w:rPr>
-                <w:rFonts w:ascii="Aptos" w:eastAsia="Aptos" w:hAnsi="Aptos" w:cs="Aptos"/>
-              </w:rPr>
-              <w:t>agents</w:t>
-            </w:r>
-            <w:proofErr w:type="gramEnd"/>
-            <w:r>
-              <w:rPr>
-                <w:rFonts w:ascii="Aptos" w:eastAsia="Aptos" w:hAnsi="Aptos" w:cs="Aptos"/>
-              </w:rPr>
-              <w:t xml:space="preserve"> recommendations and contributed to improving </w:t>
+              <w:t xml:space="preserve">Check if AI agents recommendations and contributed to improving </w:t>
             </w:r>
             <w:proofErr w:type="spellStart"/>
-            <w:proofErr w:type="gramStart"/>
             <w:r>
               <w:rPr>
                 <w:rFonts w:ascii="Aptos" w:eastAsia="Aptos" w:hAnsi="Aptos" w:cs="Aptos"/>
@@ -1041,14 +951,7 @@
               <w:rPr>
                 <w:rFonts w:ascii="Aptos" w:eastAsia="Aptos" w:hAnsi="Aptos" w:cs="Aptos"/>
               </w:rPr>
-              <w:t>‘</w:t>
-            </w:r>
-            <w:proofErr w:type="gramEnd"/>
-            <w:r>
-              <w:rPr>
-                <w:rFonts w:ascii="Aptos" w:eastAsia="Aptos" w:hAnsi="Aptos" w:cs="Aptos"/>
-              </w:rPr>
-              <w:t>s</w:t>
+              <w:t>‘s</w:t>
             </w:r>
             <w:proofErr w:type="spellEnd"/>
             <w:r>
@@ -1089,21 +992,7 @@
               <w:rPr>
                 <w:rFonts w:ascii="Aptos" w:eastAsia="Aptos" w:hAnsi="Aptos" w:cs="Aptos"/>
               </w:rPr>
-              <w:t xml:space="preserve"> to measure metrics before the implementation of the recommendation and after. These tools measure </w:t>
-            </w:r>
-            <w:proofErr w:type="gramStart"/>
-            <w:r>
-              <w:rPr>
-                <w:rFonts w:ascii="Aptos" w:eastAsia="Aptos" w:hAnsi="Aptos" w:cs="Aptos"/>
-              </w:rPr>
-              <w:t>the businesses</w:t>
-            </w:r>
-            <w:proofErr w:type="gramEnd"/>
-            <w:r>
-              <w:rPr>
-                <w:rFonts w:ascii="Aptos" w:eastAsia="Aptos" w:hAnsi="Aptos" w:cs="Aptos"/>
-              </w:rPr>
-              <w:t>' websites backlinks as well as website authority.</w:t>
+              <w:t xml:space="preserve"> to measure metrics before the implementation of the recommendation and after. These tools measure the businesses' websites backlinks as well as website authority.</w:t>
             </w:r>
           </w:p>
         </w:tc>
@@ -1127,14 +1016,6 @@
           <w:color w:val="0F4761" w:themeColor="accent1" w:themeShade="BF"/>
           <w:sz w:val="28"/>
           <w:szCs w:val="28"/>
-        </w:rPr>
-      </w:pPr>
-    </w:p>
-    <w:p>
-      <w:pPr>
-        <w:rPr>
-          <w:rFonts w:ascii="Aptos" w:eastAsia="Aptos" w:hAnsi="Aptos" w:cs="Aptos"/>
-          <w:color w:val="000000" w:themeColor="text1"/>
         </w:rPr>
       </w:pPr>
     </w:p>
@@ -1413,61 +1294,25 @@
                 <w:sz w:val="22"/>
                 <w:szCs w:val="22"/>
               </w:rPr>
-              <w:t xml:space="preserve">This one is about ensuring the Authority Manager AI agent should be able capable of reviewing the outputs of its three agents and be able to determine if </w:t>
-            </w:r>
-            <w:proofErr w:type="gramStart"/>
+              <w:t xml:space="preserve">This one is about ensuring the Authority Manager AI agent should be able capable of reviewing the outputs of its three agents and be able to determine if its completed, relevant, credible and suitable for </w:t>
+            </w:r>
+            <w:proofErr w:type="spellStart"/>
             <w:r>
               <w:rPr>
                 <w:rFonts w:ascii="Aptos" w:eastAsia="Aptos" w:hAnsi="Aptos" w:cs="Aptos"/>
                 <w:sz w:val="22"/>
                 <w:szCs w:val="22"/>
               </w:rPr>
-              <w:t>its</w:t>
-            </w:r>
-            <w:proofErr w:type="gramEnd"/>
+              <w:t>ViriVR</w:t>
+            </w:r>
+            <w:proofErr w:type="spellEnd"/>
             <w:r>
               <w:rPr>
                 <w:rFonts w:ascii="Aptos" w:eastAsia="Aptos" w:hAnsi="Aptos" w:cs="Aptos"/>
                 <w:sz w:val="22"/>
                 <w:szCs w:val="22"/>
               </w:rPr>
-              <w:t xml:space="preserve"> completed, relevant, credible and suitable for </w:t>
-            </w:r>
-            <w:proofErr w:type="spellStart"/>
-            <w:r>
-              <w:rPr>
-                <w:rFonts w:ascii="Aptos" w:eastAsia="Aptos" w:hAnsi="Aptos" w:cs="Aptos"/>
-                <w:sz w:val="22"/>
-                <w:szCs w:val="22"/>
-              </w:rPr>
-              <w:t>ViriVR</w:t>
-            </w:r>
-            <w:proofErr w:type="spellEnd"/>
-            <w:r>
-              <w:rPr>
-                <w:rFonts w:ascii="Aptos" w:eastAsia="Aptos" w:hAnsi="Aptos" w:cs="Aptos"/>
-                <w:sz w:val="22"/>
-                <w:szCs w:val="22"/>
-              </w:rPr>
-              <w:t xml:space="preserve"> to use. It should be able to identify weak, unverifiable or unsourced claims and </w:t>
-            </w:r>
-            <w:proofErr w:type="gramStart"/>
-            <w:r>
-              <w:rPr>
-                <w:rFonts w:ascii="Aptos" w:eastAsia="Aptos" w:hAnsi="Aptos" w:cs="Aptos"/>
-                <w:sz w:val="22"/>
-                <w:szCs w:val="22"/>
-              </w:rPr>
-              <w:t>opinions,</w:t>
-            </w:r>
-            <w:proofErr w:type="gramEnd"/>
-            <w:r>
-              <w:rPr>
-                <w:rFonts w:ascii="Aptos" w:eastAsia="Aptos" w:hAnsi="Aptos" w:cs="Aptos"/>
-                <w:sz w:val="22"/>
-                <w:szCs w:val="22"/>
-              </w:rPr>
-              <w:t xml:space="preserve"> that have weak brand authority, as well as factual inaccuracies and contradictions being displayed or presented as verified facts. Finally, the AI agent would need the capability to evaluate whether outputs meet the standards and requirements of </w:t>
+              <w:t xml:space="preserve"> to use. It should be able to identify weak, unverifiable or unsourced claims and opinions, that have weak brand authority, as well as factual inaccuracies and contradictions being displayed or presented as verified facts. Finally, the AI agent would need the capability to evaluate whether outputs meet the standards and requirements of </w:t>
             </w:r>
             <w:proofErr w:type="spellStart"/>
             <w:r>
@@ -1547,25 +1392,7 @@
                 <w:sz w:val="22"/>
                 <w:szCs w:val="22"/>
               </w:rPr>
-              <w:t xml:space="preserve">The Authority Manager AI agent should be able to assess the performance of its three specialist ai agents against their approved individual KPIs. It should be able to compare those results and determine in which areas the AI agents are excelling or performing poorly and whether not any changes or improvements need to be made to produce improved </w:t>
-            </w:r>
-            <w:proofErr w:type="gramStart"/>
-            <w:r>
-              <w:rPr>
-                <w:rFonts w:ascii="Aptos" w:eastAsia="Aptos" w:hAnsi="Aptos" w:cs="Aptos"/>
-                <w:sz w:val="22"/>
-                <w:szCs w:val="22"/>
-              </w:rPr>
-              <w:t>outputs</w:t>
-            </w:r>
-            <w:proofErr w:type="gramEnd"/>
-            <w:r>
-              <w:rPr>
-                <w:rFonts w:ascii="Aptos" w:eastAsia="Aptos" w:hAnsi="Aptos" w:cs="Aptos"/>
-                <w:sz w:val="22"/>
-                <w:szCs w:val="22"/>
-              </w:rPr>
-              <w:t>. This would also all be reported and provided to the human role for further verification and validation.</w:t>
+              <w:t>The Authority Manager AI agent should be able to assess the performance of its three specialist ai agents against their approved individual KPIs. It should be able to compare those results and determine in which areas the AI agents are excelling or performing poorly and whether not any changes or improvements need to be made to produce improved outputs. This would also all be reported and provided to the human role for further verification and validation.</w:t>
             </w:r>
           </w:p>
         </w:tc>
@@ -1720,35 +1547,7 @@
               <w:rPr>
                 <w:rFonts w:ascii="Aptos" w:eastAsia="Aptos" w:hAnsi="Aptos" w:cs="Aptos"/>
               </w:rPr>
-              <w:t xml:space="preserve">They need to understand how to monitor, review and improve the ai agents’ </w:t>
-            </w:r>
-            <w:proofErr w:type="gramStart"/>
-            <w:r>
-              <w:rPr>
-                <w:rFonts w:ascii="Aptos" w:eastAsia="Aptos" w:hAnsi="Aptos" w:cs="Aptos"/>
-              </w:rPr>
-              <w:t>outputs</w:t>
-            </w:r>
-            <w:proofErr w:type="gramEnd"/>
-            <w:r>
-              <w:rPr>
-                <w:rFonts w:ascii="Aptos" w:eastAsia="Aptos" w:hAnsi="Aptos" w:cs="Aptos"/>
-              </w:rPr>
-              <w:t xml:space="preserve">. The Authority Manager must assess agent’s </w:t>
-            </w:r>
-            <w:proofErr w:type="gramStart"/>
-            <w:r>
-              <w:rPr>
-                <w:rFonts w:ascii="Aptos" w:eastAsia="Aptos" w:hAnsi="Aptos" w:cs="Aptos"/>
-              </w:rPr>
-              <w:t>outputs</w:t>
-            </w:r>
-            <w:proofErr w:type="gramEnd"/>
-            <w:r>
-              <w:rPr>
-                <w:rFonts w:ascii="Aptos" w:eastAsia="Aptos" w:hAnsi="Aptos" w:cs="Aptos"/>
-              </w:rPr>
-              <w:t xml:space="preserve"> against established requirements and acceptance criteria, identify issues or complications, inaccurate information and be able to improve instructions, inputs and workflows where necessary.</w:t>
+              <w:t>They need to understand how to monitor, review and improve the ai agents’ outputs. The Authority Manager must assess agent’s outputs against established requirements and acceptance criteria, identify issues or complications, inaccurate information and be able to improve instructions, inputs and workflows where necessary.</w:t>
             </w:r>
           </w:p>
         </w:tc>
@@ -1793,35 +1592,7 @@
               <w:rPr>
                 <w:rFonts w:ascii="Aptos" w:eastAsia="Aptos" w:hAnsi="Aptos" w:cs="Aptos"/>
               </w:rPr>
-              <w:t xml:space="preserve">The Authority Manager must have a strong understanding of the concepts on digital and branding authority, this would include how to increase external trust, garner citations and links, traffic referrals from domain authority, brand visibility and enhance outreach. They will determine </w:t>
-            </w:r>
-            <w:proofErr w:type="gramStart"/>
-            <w:r>
-              <w:rPr>
-                <w:rFonts w:ascii="Aptos" w:eastAsia="Aptos" w:hAnsi="Aptos" w:cs="Aptos"/>
-              </w:rPr>
-              <w:t>if</w:t>
-            </w:r>
-            <w:proofErr w:type="gramEnd"/>
-            <w:r>
-              <w:rPr>
-                <w:rFonts w:ascii="Aptos" w:eastAsia="Aptos" w:hAnsi="Aptos" w:cs="Aptos"/>
-              </w:rPr>
-              <w:t xml:space="preserve"> a suggestion or output from the AI agents for a valid and effective business proposal or </w:t>
-            </w:r>
-            <w:proofErr w:type="gramStart"/>
-            <w:r>
-              <w:rPr>
-                <w:rFonts w:ascii="Aptos" w:eastAsia="Aptos" w:hAnsi="Aptos" w:cs="Aptos"/>
-              </w:rPr>
-              <w:t>something is</w:t>
-            </w:r>
-            <w:proofErr w:type="gramEnd"/>
-            <w:r>
-              <w:rPr>
-                <w:rFonts w:ascii="Aptos" w:eastAsia="Aptos" w:hAnsi="Aptos" w:cs="Aptos"/>
-              </w:rPr>
-              <w:t xml:space="preserve"> that needs further improvement.  </w:t>
+              <w:t xml:space="preserve">The Authority Manager must have a strong understanding of the concepts on digital and branding authority, this would include how to increase external trust, garner citations and links, traffic referrals from domain authority, brand visibility and enhance outreach. They will determine if a suggestion or output from the AI agents for a valid and effective business proposal or something is that needs further improvement.  </w:t>
             </w:r>
           </w:p>
         </w:tc>
@@ -1888,21 +1659,7 @@
               <w:rPr>
                 <w:rFonts w:ascii="Aptos" w:eastAsia="Aptos" w:hAnsi="Aptos" w:cs="Aptos"/>
               </w:rPr>
-              <w:t xml:space="preserve">strategic goals and wider business and marketing objectives. They must be able to develop and identify appropriate strategies and opportunities that are generated by the AI agents to understand which outputs will improve the </w:t>
-            </w:r>
-            <w:proofErr w:type="gramStart"/>
-            <w:r>
-              <w:rPr>
-                <w:rFonts w:ascii="Aptos" w:eastAsia="Aptos" w:hAnsi="Aptos" w:cs="Aptos"/>
-              </w:rPr>
-              <w:t>businesses</w:t>
-            </w:r>
-            <w:proofErr w:type="gramEnd"/>
-            <w:r>
-              <w:rPr>
-                <w:rFonts w:ascii="Aptos" w:eastAsia="Aptos" w:hAnsi="Aptos" w:cs="Aptos"/>
-              </w:rPr>
-              <w:t xml:space="preserve"> domain authority and digital brand presence.</w:t>
+              <w:t>strategic goals and wider business and marketing objectives. They must be able to develop and identify appropriate strategies and opportunities that are generated by the AI agents to understand which outputs will improve the businesses domain authority and digital brand presence.</w:t>
             </w:r>
           </w:p>
         </w:tc>
@@ -1995,35 +1752,7 @@
               <w:rPr>
                 <w:rFonts w:ascii="Aptos" w:eastAsia="Aptos" w:hAnsi="Aptos" w:cs="Aptos"/>
               </w:rPr>
-              <w:t xml:space="preserve">Being able to evaluate the recommendations from the agents, validate </w:t>
-            </w:r>
-            <w:proofErr w:type="gramStart"/>
-            <w:r>
-              <w:rPr>
-                <w:rFonts w:ascii="Aptos" w:eastAsia="Aptos" w:hAnsi="Aptos" w:cs="Aptos"/>
-              </w:rPr>
-              <w:t>its</w:t>
-            </w:r>
-            <w:proofErr w:type="gramEnd"/>
-            <w:r>
-              <w:rPr>
-                <w:rFonts w:ascii="Aptos" w:eastAsia="Aptos" w:hAnsi="Aptos" w:cs="Aptos"/>
-              </w:rPr>
-              <w:t xml:space="preserve"> sources, identify risks, as well as </w:t>
-            </w:r>
-            <w:proofErr w:type="gramStart"/>
-            <w:r>
-              <w:rPr>
-                <w:rFonts w:ascii="Aptos" w:eastAsia="Aptos" w:hAnsi="Aptos" w:cs="Aptos"/>
-              </w:rPr>
-              <w:t>its</w:t>
-            </w:r>
-            <w:proofErr w:type="gramEnd"/>
-            <w:r>
-              <w:rPr>
-                <w:rFonts w:ascii="Aptos" w:eastAsia="Aptos" w:hAnsi="Aptos" w:cs="Aptos"/>
-              </w:rPr>
-              <w:t xml:space="preserve"> strengths and weaknesses.  It's important for the Authority Manager to be able to determine if the outputs </w:t>
+              <w:t xml:space="preserve">Being able to evaluate the recommendations from the agents, validate its sources, identify risks, as well as its strengths and weaknesses.  It's important for the Authority Manager to be able to determine if the outputs </w:t>
             </w:r>
           </w:p>
         </w:tc>
@@ -2221,25 +1950,7 @@
           <w:sz w:val="22"/>
           <w:szCs w:val="22"/>
         </w:rPr>
-        <w:t xml:space="preserve">Step 6: Determine how the work should be handled, either by specialist agent or by the Authority </w:t>
-      </w:r>
-      <w:proofErr w:type="gramStart"/>
-      <w:r>
-        <w:rPr>
-          <w:rFonts w:ascii="Aptos" w:eastAsia="Aptos" w:hAnsi="Aptos" w:cs="Aptos"/>
-          <w:sz w:val="22"/>
-          <w:szCs w:val="22"/>
-        </w:rPr>
-        <w:t>Manager</w:t>
-      </w:r>
-      <w:proofErr w:type="gramEnd"/>
-      <w:r>
-        <w:rPr>
-          <w:rFonts w:ascii="Aptos" w:eastAsia="Aptos" w:hAnsi="Aptos" w:cs="Aptos"/>
-          <w:sz w:val="22"/>
-          <w:szCs w:val="22"/>
-        </w:rPr>
-        <w:t xml:space="preserve"> where it may conduct a content audit. </w:t>
+        <w:t xml:space="preserve">Step 6: Determine how the work should be handled, either by specialist agent or by the Authority Manager where it may conduct a content audit. </w:t>
       </w:r>
     </w:p>
     <w:p>
@@ -2252,25 +1963,7 @@
           <w:sz w:val="22"/>
           <w:szCs w:val="22"/>
         </w:rPr>
-        <w:t xml:space="preserve">Step 7: If work requires </w:t>
-      </w:r>
-      <w:proofErr w:type="gramStart"/>
-      <w:r>
-        <w:rPr>
-          <w:rFonts w:ascii="Aptos" w:eastAsia="Aptos" w:hAnsi="Aptos" w:cs="Aptos"/>
-          <w:sz w:val="22"/>
-          <w:szCs w:val="22"/>
-        </w:rPr>
-        <w:t>the specialist</w:t>
-      </w:r>
-      <w:proofErr w:type="gramEnd"/>
-      <w:r>
-        <w:rPr>
-          <w:rFonts w:ascii="Aptos" w:eastAsia="Aptos" w:hAnsi="Aptos" w:cs="Aptos"/>
-          <w:sz w:val="22"/>
-          <w:szCs w:val="22"/>
-        </w:rPr>
-        <w:t xml:space="preserve"> agents, the Authority Manager would prepare the work package with its objective, approved inputs and sources, requirements, Acceptance Criteria, expected output, constraints and any relevant dependencies or supporting documentation.</w:t>
+        <w:t>Step 7: If work requires the specialist agents, the Authority Manager would prepare the work package with its objective, approved inputs and sources, requirements, Acceptance Criteria, expected output, constraints and any relevant dependencies or supporting documentation.</w:t>
       </w:r>
     </w:p>
     <w:p>
@@ -2323,29 +2016,7 @@
           <w:sz w:val="22"/>
           <w:szCs w:val="22"/>
         </w:rPr>
-        <w:t>2</w:t>
-      </w:r>
-      <w:proofErr w:type="gramStart"/>
-      <w:r>
-        <w:rPr>
-          <w:rFonts w:ascii="Aptos" w:eastAsia="Aptos" w:hAnsi="Aptos" w:cs="Aptos"/>
-          <w:b/>
-          <w:bCs/>
-          <w:sz w:val="22"/>
-          <w:szCs w:val="22"/>
-        </w:rPr>
-        <w:t>.  Preliminary</w:t>
-      </w:r>
-      <w:proofErr w:type="gramEnd"/>
-      <w:r>
-        <w:rPr>
-          <w:rFonts w:ascii="Aptos" w:eastAsia="Aptos" w:hAnsi="Aptos" w:cs="Aptos"/>
-          <w:b/>
-          <w:bCs/>
-          <w:sz w:val="22"/>
-          <w:szCs w:val="22"/>
-        </w:rPr>
-        <w:t xml:space="preserve"> Content and Authority Audit, Quality and Brand Review</w:t>
+        <w:t>2.  Preliminary Content and Authority Audit, Quality and Brand Review</w:t>
       </w:r>
     </w:p>
     <w:p>
@@ -2368,25 +2039,7 @@
           <w:sz w:val="22"/>
           <w:szCs w:val="22"/>
         </w:rPr>
-        <w:t xml:space="preserve"> Receive completed content. This can include landing pages, website pages, new or revised content pages or any other content that can be identified through a website xml file as well as any other supporting documentation. The Authority Manager should be able to identify exactly what is being audited and what </w:t>
-      </w:r>
-      <w:proofErr w:type="gramStart"/>
-      <w:r>
-        <w:rPr>
-          <w:rFonts w:ascii="Aptos" w:eastAsia="Aptos" w:hAnsi="Aptos" w:cs="Aptos"/>
-          <w:sz w:val="22"/>
-          <w:szCs w:val="22"/>
-        </w:rPr>
-        <w:t>is the purpose of the content</w:t>
-      </w:r>
-      <w:proofErr w:type="gramEnd"/>
-      <w:r>
-        <w:rPr>
-          <w:rFonts w:ascii="Aptos" w:eastAsia="Aptos" w:hAnsi="Aptos" w:cs="Aptos"/>
-          <w:sz w:val="22"/>
-          <w:szCs w:val="22"/>
-        </w:rPr>
-        <w:t>.</w:t>
+        <w:t xml:space="preserve"> Receive completed content. This can include landing pages, website pages, new or revised content pages or any other content that can be identified through a website xml file as well as any other supporting documentation. The Authority Manager should be able to identify exactly what is being audited and what is the purpose of the content.</w:t>
       </w:r>
     </w:p>
     <w:p>
@@ -2547,9 +2200,11 @@
           <w:szCs w:val="22"/>
           <w:lang w:val="en-AU"/>
         </w:rPr>
-        <w:t xml:space="preserve">Consistency: </w:t>
-      </w:r>
-      <w:proofErr w:type="gramStart"/>
+        <w:t xml:space="preserve">Consistency: Is the information, wording and presentation consistent with approved sources, brand requirements and related website content? </w:t>
+      </w:r>
+      <w:r>
+        <w:br/>
+      </w:r>
       <w:r>
         <w:rPr>
           <w:rFonts w:ascii="Aptos" w:eastAsia="Aptos" w:hAnsi="Aptos" w:cs="Aptos"/>
@@ -2557,9 +2212,9 @@
           <w:szCs w:val="22"/>
           <w:lang w:val="en-AU"/>
         </w:rPr>
-        <w:t>Is</w:t>
-      </w:r>
-      <w:proofErr w:type="gramEnd"/>
+        <w:t xml:space="preserve">Safety: Does the content avoid misleading, harmful or inappropriate claims, language or presentation that could create risk for </w:t>
+      </w:r>
+      <w:proofErr w:type="spellStart"/>
       <w:r>
         <w:rPr>
           <w:rFonts w:ascii="Aptos" w:eastAsia="Aptos" w:hAnsi="Aptos" w:cs="Aptos"/>
@@ -2567,7 +2222,17 @@
           <w:szCs w:val="22"/>
           <w:lang w:val="en-AU"/>
         </w:rPr>
-        <w:t xml:space="preserve"> the information, wording and presentation consistent with approved sources, brand requirements and related website content? </w:t>
+        <w:t>ViriVR</w:t>
+      </w:r>
+      <w:proofErr w:type="spellEnd"/>
+      <w:r>
+        <w:rPr>
+          <w:rFonts w:ascii="Aptos" w:eastAsia="Aptos" w:hAnsi="Aptos" w:cs="Aptos"/>
+          <w:sz w:val="22"/>
+          <w:szCs w:val="22"/>
+          <w:lang w:val="en-AU"/>
+        </w:rPr>
+        <w:t xml:space="preserve">? </w:t>
       </w:r>
       <w:r>
         <w:br/>
@@ -2579,7 +2244,42 @@
           <w:szCs w:val="22"/>
           <w:lang w:val="en-AU"/>
         </w:rPr>
-        <w:t xml:space="preserve">Safety: Does the content avoid misleading, harmful or inappropriate claims, language or presentation that could create risk for </w:t>
+        <w:t>Any issues or failings of these quality gates should be documented.</w:t>
+      </w:r>
+    </w:p>
+    <w:p>
+      <w:pPr>
+        <w:spacing w:line="257" w:lineRule="auto"/>
+      </w:pPr>
+      <w:r>
+        <w:rPr>
+          <w:rFonts w:ascii="Aptos" w:eastAsia="Aptos" w:hAnsi="Aptos" w:cs="Aptos"/>
+          <w:b/>
+          <w:bCs/>
+          <w:sz w:val="22"/>
+          <w:szCs w:val="22"/>
+        </w:rPr>
+        <w:t>Step 5:</w:t>
+      </w:r>
+      <w:r>
+        <w:rPr>
+          <w:rFonts w:ascii="Aptos" w:eastAsia="Aptos" w:hAnsi="Aptos" w:cs="Aptos"/>
+          <w:sz w:val="22"/>
+          <w:szCs w:val="22"/>
+        </w:rPr>
+        <w:t xml:space="preserve"> Identify strengths, weaknesses and issues with the content. </w:t>
+      </w:r>
+      <w:r>
+        <w:br/>
+      </w:r>
+      <w:r>
+        <w:rPr>
+          <w:rFonts w:ascii="Aptos" w:eastAsia="Aptos" w:hAnsi="Aptos" w:cs="Aptos"/>
+          <w:sz w:val="22"/>
+          <w:szCs w:val="22"/>
+          <w:lang w:val="en-AU"/>
+        </w:rPr>
+        <w:t xml:space="preserve">Strengths could include; topic relevance, strong and accurate evidence, useful information, a clear explanation of services, appropriate audience targeting, relevant keyword and topic coverage, content with potential to attract citations or links, and alignment with </w:t>
       </w:r>
       <w:proofErr w:type="spellStart"/>
       <w:r>
@@ -2589,6 +2289,141 @@
           <w:szCs w:val="22"/>
           <w:lang w:val="en-AU"/>
         </w:rPr>
+        <w:t>ViriVR's</w:t>
+      </w:r>
+      <w:proofErr w:type="spellEnd"/>
+      <w:r>
+        <w:rPr>
+          <w:rFonts w:ascii="Aptos" w:eastAsia="Aptos" w:hAnsi="Aptos" w:cs="Aptos"/>
+          <w:sz w:val="22"/>
+          <w:szCs w:val="22"/>
+          <w:lang w:val="en-AU"/>
+        </w:rPr>
+        <w:t xml:space="preserve"> brand positioning.</w:t>
+      </w:r>
+      <w:r>
+        <w:rPr>
+          <w:rFonts w:ascii="Aptos" w:eastAsia="Aptos" w:hAnsi="Aptos" w:cs="Aptos"/>
+          <w:sz w:val="22"/>
+          <w:szCs w:val="22"/>
+        </w:rPr>
+        <w:t xml:space="preserve"> </w:t>
+      </w:r>
+      <w:r>
+        <w:br/>
+      </w:r>
+      <w:r>
+        <w:rPr>
+          <w:rFonts w:ascii="Aptos" w:eastAsia="Aptos" w:hAnsi="Aptos" w:cs="Aptos"/>
+          <w:sz w:val="22"/>
+          <w:szCs w:val="22"/>
+        </w:rPr>
+        <w:t xml:space="preserve">Weaknesses could include; off topic relevancy or targeting wrong audience, weak or unsupported evidence and claims, inconsistence wording and language, poor structure or presentation, limited authority signals, and misleading the brands representation and goals. </w:t>
+      </w:r>
+    </w:p>
+    <w:p>
+      <w:pPr>
+        <w:spacing w:line="257" w:lineRule="auto"/>
+      </w:pPr>
+      <w:r>
+        <w:rPr>
+          <w:rFonts w:ascii="Aptos" w:eastAsia="Aptos" w:hAnsi="Aptos" w:cs="Aptos"/>
+          <w:b/>
+          <w:bCs/>
+          <w:sz w:val="22"/>
+          <w:szCs w:val="22"/>
+        </w:rPr>
+        <w:t xml:space="preserve">Step 6: </w:t>
+      </w:r>
+      <w:r>
+        <w:rPr>
+          <w:rFonts w:ascii="Aptos" w:eastAsia="Aptos" w:hAnsi="Aptos" w:cs="Aptos"/>
+          <w:sz w:val="22"/>
+          <w:szCs w:val="22"/>
+          <w:lang w:val="en-AU"/>
+        </w:rPr>
+        <w:t xml:space="preserve">Identify how the content may positively or negatively impact </w:t>
+      </w:r>
+      <w:proofErr w:type="spellStart"/>
+      <w:r>
+        <w:rPr>
+          <w:rFonts w:ascii="Aptos" w:eastAsia="Aptos" w:hAnsi="Aptos" w:cs="Aptos"/>
+          <w:sz w:val="22"/>
+          <w:szCs w:val="22"/>
+          <w:lang w:val="en-AU"/>
+        </w:rPr>
+        <w:t>ViriVR's</w:t>
+      </w:r>
+      <w:proofErr w:type="spellEnd"/>
+      <w:r>
+        <w:rPr>
+          <w:rFonts w:ascii="Aptos" w:eastAsia="Aptos" w:hAnsi="Aptos" w:cs="Aptos"/>
+          <w:sz w:val="22"/>
+          <w:szCs w:val="22"/>
+          <w:lang w:val="en-AU"/>
+        </w:rPr>
+        <w:t xml:space="preserve"> SEO, search visibility, topic relevance, external trust or credibility, citations, links and backlinks and brand authority. It should explain the potential impact without inventing or guaranteeing SEO results that cannot be supported by evidence.</w:t>
+      </w:r>
+    </w:p>
+    <w:p>
+      <w:pPr>
+        <w:spacing w:line="257" w:lineRule="auto"/>
+      </w:pPr>
+      <w:r>
+        <w:rPr>
+          <w:rFonts w:ascii="Aptos" w:eastAsia="Aptos" w:hAnsi="Aptos" w:cs="Aptos"/>
+          <w:b/>
+          <w:bCs/>
+          <w:sz w:val="22"/>
+          <w:szCs w:val="22"/>
+        </w:rPr>
+        <w:t>Step 7:</w:t>
+      </w:r>
+      <w:r>
+        <w:rPr>
+          <w:rFonts w:ascii="Aptos" w:eastAsia="Aptos" w:hAnsi="Aptos" w:cs="Aptos"/>
+          <w:sz w:val="22"/>
+          <w:szCs w:val="22"/>
+        </w:rPr>
+        <w:t xml:space="preserve"> </w:t>
+      </w:r>
+      <w:r>
+        <w:rPr>
+          <w:rFonts w:ascii="Aptos" w:eastAsia="Aptos" w:hAnsi="Aptos" w:cs="Aptos"/>
+          <w:sz w:val="22"/>
+          <w:szCs w:val="22"/>
+          <w:lang w:val="en-AU"/>
+        </w:rPr>
+        <w:t xml:space="preserve">Check whether the content represents </w:t>
+      </w:r>
+      <w:proofErr w:type="spellStart"/>
+      <w:r>
+        <w:rPr>
+          <w:rFonts w:ascii="Aptos" w:eastAsia="Aptos" w:hAnsi="Aptos" w:cs="Aptos"/>
+          <w:sz w:val="22"/>
+          <w:szCs w:val="22"/>
+          <w:lang w:val="en-AU"/>
+        </w:rPr>
+        <w:t>ViriVR's</w:t>
+      </w:r>
+      <w:proofErr w:type="spellEnd"/>
+      <w:r>
+        <w:rPr>
+          <w:rFonts w:ascii="Aptos" w:eastAsia="Aptos" w:hAnsi="Aptos" w:cs="Aptos"/>
+          <w:sz w:val="22"/>
+          <w:szCs w:val="22"/>
+          <w:lang w:val="en-AU"/>
+        </w:rPr>
+        <w:t xml:space="preserve"> brand accurately, appropriately and professionally in accordance with approved brand guidelines and business requirements. This includes checking whether the content correctly describes </w:t>
+      </w:r>
+      <w:proofErr w:type="spellStart"/>
+      <w:r>
+        <w:rPr>
+          <w:rFonts w:ascii="Aptos" w:eastAsia="Aptos" w:hAnsi="Aptos" w:cs="Aptos"/>
+          <w:sz w:val="22"/>
+          <w:szCs w:val="22"/>
+          <w:lang w:val="en-AU"/>
+        </w:rPr>
         <w:t>ViriVR</w:t>
       </w:r>
       <w:proofErr w:type="spellEnd"/>
@@ -2599,222 +2434,20 @@
           <w:szCs w:val="22"/>
           <w:lang w:val="en-AU"/>
         </w:rPr>
-        <w:t xml:space="preserve">? </w:t>
-      </w:r>
-      <w:r>
-        <w:br/>
-      </w:r>
-      <w:r>
-        <w:rPr>
-          <w:rFonts w:ascii="Aptos" w:eastAsia="Aptos" w:hAnsi="Aptos" w:cs="Aptos"/>
-          <w:sz w:val="22"/>
-          <w:szCs w:val="22"/>
-          <w:lang w:val="en-AU"/>
-        </w:rPr>
-        <w:t>Any issues or failings of these quality gates should be documented.</w:t>
+        <w:t xml:space="preserve"> and its services, targets the appropriate audiences, avoids misleading or unverifiable claims or assumptions, and does not use wording, messaging or visuals that could damage the trust, credibility or reputation of the business.</w:t>
+      </w:r>
+      <w:r>
+        <w:rPr>
+          <w:rFonts w:ascii="Aptos" w:eastAsia="Aptos" w:hAnsi="Aptos" w:cs="Aptos"/>
+          <w:sz w:val="22"/>
+          <w:szCs w:val="22"/>
+        </w:rPr>
+        <w:t xml:space="preserve"> </w:t>
       </w:r>
     </w:p>
     <w:p>
       <w:pPr>
         <w:spacing w:line="257" w:lineRule="auto"/>
-      </w:pPr>
-      <w:r>
-        <w:rPr>
-          <w:rFonts w:ascii="Aptos" w:eastAsia="Aptos" w:hAnsi="Aptos" w:cs="Aptos"/>
-          <w:b/>
-          <w:bCs/>
-          <w:sz w:val="22"/>
-          <w:szCs w:val="22"/>
-        </w:rPr>
-        <w:t>Step 5:</w:t>
-      </w:r>
-      <w:r>
-        <w:rPr>
-          <w:rFonts w:ascii="Aptos" w:eastAsia="Aptos" w:hAnsi="Aptos" w:cs="Aptos"/>
-          <w:sz w:val="22"/>
-          <w:szCs w:val="22"/>
-        </w:rPr>
-        <w:t xml:space="preserve"> Identify strengths, weaknesses and issues with the content. </w:t>
-      </w:r>
-      <w:r>
-        <w:br/>
-      </w:r>
-      <w:r>
-        <w:rPr>
-          <w:rFonts w:ascii="Aptos" w:eastAsia="Aptos" w:hAnsi="Aptos" w:cs="Aptos"/>
-          <w:sz w:val="22"/>
-          <w:szCs w:val="22"/>
-          <w:lang w:val="en-AU"/>
-        </w:rPr>
-        <w:t xml:space="preserve">Strengths could include; topic relevance, strong and accurate evidence, useful information, a clear explanation of services, appropriate audience targeting, relevant keyword and topic coverage, content with potential to attract citations or links, and alignment with </w:t>
-      </w:r>
-      <w:proofErr w:type="spellStart"/>
-      <w:r>
-        <w:rPr>
-          <w:rFonts w:ascii="Aptos" w:eastAsia="Aptos" w:hAnsi="Aptos" w:cs="Aptos"/>
-          <w:sz w:val="22"/>
-          <w:szCs w:val="22"/>
-          <w:lang w:val="en-AU"/>
-        </w:rPr>
-        <w:t>ViriVR's</w:t>
-      </w:r>
-      <w:proofErr w:type="spellEnd"/>
-      <w:r>
-        <w:rPr>
-          <w:rFonts w:ascii="Aptos" w:eastAsia="Aptos" w:hAnsi="Aptos" w:cs="Aptos"/>
-          <w:sz w:val="22"/>
-          <w:szCs w:val="22"/>
-          <w:lang w:val="en-AU"/>
-        </w:rPr>
-        <w:t xml:space="preserve"> brand positioning.</w:t>
-      </w:r>
-      <w:r>
-        <w:rPr>
-          <w:rFonts w:ascii="Aptos" w:eastAsia="Aptos" w:hAnsi="Aptos" w:cs="Aptos"/>
-          <w:sz w:val="22"/>
-          <w:szCs w:val="22"/>
-        </w:rPr>
-        <w:t xml:space="preserve"> </w:t>
-      </w:r>
-      <w:r>
-        <w:br/>
-      </w:r>
-      <w:r>
-        <w:rPr>
-          <w:rFonts w:ascii="Aptos" w:eastAsia="Aptos" w:hAnsi="Aptos" w:cs="Aptos"/>
-          <w:sz w:val="22"/>
-          <w:szCs w:val="22"/>
-        </w:rPr>
-        <w:t xml:space="preserve">Weaknesses could include; off topic relevancy or targeting wrong audience, weak or unsupported evidence and claims, inconsistence wording and language, poor structure or presentation, limited authority signals, and misleading the brands representation and goals. </w:t>
-      </w:r>
-    </w:p>
-    <w:p>
-      <w:pPr>
-        <w:spacing w:line="257" w:lineRule="auto"/>
-      </w:pPr>
-      <w:r>
-        <w:rPr>
-          <w:rFonts w:ascii="Aptos" w:eastAsia="Aptos" w:hAnsi="Aptos" w:cs="Aptos"/>
-          <w:b/>
-          <w:bCs/>
-          <w:sz w:val="22"/>
-          <w:szCs w:val="22"/>
-        </w:rPr>
-        <w:t xml:space="preserve">Step 6: </w:t>
-      </w:r>
-      <w:r>
-        <w:rPr>
-          <w:rFonts w:ascii="Aptos" w:eastAsia="Aptos" w:hAnsi="Aptos" w:cs="Aptos"/>
-          <w:sz w:val="22"/>
-          <w:szCs w:val="22"/>
-          <w:lang w:val="en-AU"/>
-        </w:rPr>
-        <w:t xml:space="preserve">Identify how the content may positively or negatively impact </w:t>
-      </w:r>
-      <w:proofErr w:type="spellStart"/>
-      <w:r>
-        <w:rPr>
-          <w:rFonts w:ascii="Aptos" w:eastAsia="Aptos" w:hAnsi="Aptos" w:cs="Aptos"/>
-          <w:sz w:val="22"/>
-          <w:szCs w:val="22"/>
-          <w:lang w:val="en-AU"/>
-        </w:rPr>
-        <w:t>ViriVR's</w:t>
-      </w:r>
-      <w:proofErr w:type="spellEnd"/>
-      <w:r>
-        <w:rPr>
-          <w:rFonts w:ascii="Aptos" w:eastAsia="Aptos" w:hAnsi="Aptos" w:cs="Aptos"/>
-          <w:sz w:val="22"/>
-          <w:szCs w:val="22"/>
-          <w:lang w:val="en-AU"/>
-        </w:rPr>
-        <w:t xml:space="preserve"> SEO, search visibility, topic relevance, external trust or credibility, citations, links and backlinks and brand authority. It should explain the potential impact without inventing or guaranteeing SEO results that cannot be supported by evidence.</w:t>
-      </w:r>
-    </w:p>
-    <w:p>
-      <w:pPr>
-        <w:spacing w:line="257" w:lineRule="auto"/>
-      </w:pPr>
-      <w:r>
-        <w:rPr>
-          <w:rFonts w:ascii="Aptos" w:eastAsia="Aptos" w:hAnsi="Aptos" w:cs="Aptos"/>
-          <w:b/>
-          <w:bCs/>
-          <w:sz w:val="22"/>
-          <w:szCs w:val="22"/>
-        </w:rPr>
-        <w:t>Step 7:</w:t>
-      </w:r>
-      <w:r>
-        <w:rPr>
-          <w:rFonts w:ascii="Aptos" w:eastAsia="Aptos" w:hAnsi="Aptos" w:cs="Aptos"/>
-          <w:sz w:val="22"/>
-          <w:szCs w:val="22"/>
-        </w:rPr>
-        <w:t xml:space="preserve"> </w:t>
-      </w:r>
-      <w:r>
-        <w:rPr>
-          <w:rFonts w:ascii="Aptos" w:eastAsia="Aptos" w:hAnsi="Aptos" w:cs="Aptos"/>
-          <w:sz w:val="22"/>
-          <w:szCs w:val="22"/>
-          <w:lang w:val="en-AU"/>
-        </w:rPr>
-        <w:t xml:space="preserve">Check whether the content represents </w:t>
-      </w:r>
-      <w:proofErr w:type="spellStart"/>
-      <w:r>
-        <w:rPr>
-          <w:rFonts w:ascii="Aptos" w:eastAsia="Aptos" w:hAnsi="Aptos" w:cs="Aptos"/>
-          <w:sz w:val="22"/>
-          <w:szCs w:val="22"/>
-          <w:lang w:val="en-AU"/>
-        </w:rPr>
-        <w:t>ViriVR's</w:t>
-      </w:r>
-      <w:proofErr w:type="spellEnd"/>
-      <w:r>
-        <w:rPr>
-          <w:rFonts w:ascii="Aptos" w:eastAsia="Aptos" w:hAnsi="Aptos" w:cs="Aptos"/>
-          <w:sz w:val="22"/>
-          <w:szCs w:val="22"/>
-          <w:lang w:val="en-AU"/>
-        </w:rPr>
-        <w:t xml:space="preserve"> brand accurately, appropriately and professionally in accordance with approved brand guidelines and business requirements. This includes checking whether the content correctly describes </w:t>
-      </w:r>
-      <w:proofErr w:type="spellStart"/>
-      <w:r>
-        <w:rPr>
-          <w:rFonts w:ascii="Aptos" w:eastAsia="Aptos" w:hAnsi="Aptos" w:cs="Aptos"/>
-          <w:sz w:val="22"/>
-          <w:szCs w:val="22"/>
-          <w:lang w:val="en-AU"/>
-        </w:rPr>
-        <w:t>ViriVR</w:t>
-      </w:r>
-      <w:proofErr w:type="spellEnd"/>
-      <w:r>
-        <w:rPr>
-          <w:rFonts w:ascii="Aptos" w:eastAsia="Aptos" w:hAnsi="Aptos" w:cs="Aptos"/>
-          <w:sz w:val="22"/>
-          <w:szCs w:val="22"/>
-          <w:lang w:val="en-AU"/>
-        </w:rPr>
-        <w:t xml:space="preserve"> and its services, targets the appropriate audiences, avoids misleading or unverifiable claims or assumptions, and does not use wording, messaging or visuals that could damage the trust, credibility or reputation of the business.</w:t>
-      </w:r>
-      <w:r>
-        <w:rPr>
-          <w:rFonts w:ascii="Aptos" w:eastAsia="Aptos" w:hAnsi="Aptos" w:cs="Aptos"/>
-          <w:sz w:val="22"/>
-          <w:szCs w:val="22"/>
-        </w:rPr>
-        <w:t xml:space="preserve"> </w:t>
-      </w:r>
-    </w:p>
-    <w:p>
-      <w:pPr>
-        <w:spacing w:line="257" w:lineRule="auto"/>
         <w:rPr>
           <w:rFonts w:ascii="Aptos" w:eastAsia="Aptos" w:hAnsi="Aptos" w:cs="Aptos"/>
           <w:sz w:val="22"/>
@@ -2837,25 +2470,7 @@
           <w:sz w:val="22"/>
           <w:szCs w:val="22"/>
         </w:rPr>
-        <w:t xml:space="preserve"> Identify any of the findings from this audit that could require further work or analysis from one or more of the specialist agents. Until the specialist agents are operational, these findings should be marked as requiring specialist review rather than </w:t>
-      </w:r>
-      <w:proofErr w:type="gramStart"/>
-      <w:r>
-        <w:rPr>
-          <w:rFonts w:ascii="Aptos" w:eastAsia="Aptos" w:hAnsi="Aptos" w:cs="Aptos"/>
-          <w:sz w:val="22"/>
-          <w:szCs w:val="22"/>
-        </w:rPr>
-        <w:t>see</w:t>
-      </w:r>
-      <w:proofErr w:type="gramEnd"/>
-      <w:r>
-        <w:rPr>
-          <w:rFonts w:ascii="Aptos" w:eastAsia="Aptos" w:hAnsi="Aptos" w:cs="Aptos"/>
-          <w:sz w:val="22"/>
-          <w:szCs w:val="22"/>
-        </w:rPr>
-        <w:t xml:space="preserve"> as a completed specialist analysis. The findings may be flagged for future review by the specialist ai agents, which cover the following:</w:t>
+        <w:t xml:space="preserve"> Identify any of the findings from this audit that could require further work or analysis from one or more of the specialist agents. Until the specialist agents are operational, these findings should be marked as requiring specialist review rather than see as a completed specialist analysis. The findings may be flagged for future review by the specialist ai agents, which cover the following:</w:t>
       </w:r>
       <w:r>
         <w:br/>
@@ -3327,6 +2942,24 @@
     </w:p>
     <w:p>
       <w:pPr>
+        <w:spacing w:before="240" w:after="240"/>
+        <w:rPr>
+          <w:rFonts w:ascii="Aptos" w:eastAsia="Aptos" w:hAnsi="Aptos" w:cs="Aptos"/>
+          <w:color w:val="000000" w:themeColor="text1"/>
+        </w:rPr>
+      </w:pPr>
+    </w:p>
+    <w:p>
+      <w:pPr>
+        <w:spacing w:before="240" w:after="240"/>
+        <w:rPr>
+          <w:rFonts w:ascii="Aptos" w:eastAsia="Aptos" w:hAnsi="Aptos" w:cs="Aptos"/>
+          <w:color w:val="000000" w:themeColor="text1"/>
+        </w:rPr>
+      </w:pPr>
+    </w:p>
+    <w:p>
+      <w:pPr>
         <w:keepNext/>
         <w:keepLines/>
         <w:rPr>
@@ -3343,6 +2976,7 @@
           <w:sz w:val="28"/>
           <w:szCs w:val="28"/>
         </w:rPr>
+        <w:lastRenderedPageBreak/>
         <w:t>Original Workflow</w:t>
       </w:r>
     </w:p>
@@ -3371,15 +3005,7 @@
           <w:rFonts w:ascii="Aptos" w:eastAsia="Aptos" w:hAnsi="Aptos" w:cs="Aptos"/>
           <w:color w:val="000000" w:themeColor="text1"/>
         </w:rPr>
-        <w:t xml:space="preserve"> → The Authority Manager will check whether the request is ready, completed and within the </w:t>
-      </w:r>
-      <w:r>
-        <w:rPr>
-          <w:rFonts w:ascii="Aptos" w:eastAsia="Aptos" w:hAnsi="Aptos" w:cs="Aptos"/>
-          <w:color w:val="000000" w:themeColor="text1"/>
-        </w:rPr>
-        <w:lastRenderedPageBreak/>
-        <w:t xml:space="preserve">AI agent's scope. If there are missing fields, incorrect information or its outside the AI agents scope the request will be denied or escalated if necessary. </w:t>
+        <w:t xml:space="preserve"> → The Authority Manager will check whether the request is ready, completed and within the AI agent's scope. If there are missing fields, incorrect information or its outside the AI agents scope the request will be denied or escalated if necessary. </w:t>
       </w:r>
     </w:p>
     <w:p>
@@ -4083,15 +3709,7 @@
         <w:keepLines/>
       </w:pPr>
       <w:r>
-        <w:t xml:space="preserve">2. If there is any information </w:t>
-      </w:r>
-      <w:proofErr w:type="gramStart"/>
-      <w:r>
-        <w:t>that it</w:t>
-      </w:r>
-      <w:proofErr w:type="gramEnd"/>
-      <w:r>
-        <w:t xml:space="preserve"> doesn't understand or needs clarification, it must identify and outline the complication or issue so it can be given human approval and </w:t>
+        <w:t xml:space="preserve">2. If there is any information that it doesn't understand or needs clarification, it must identify and outline the complication or issue so it can be given human approval and </w:t>
       </w:r>
       <w:proofErr w:type="spellStart"/>
       <w:r>
@@ -4143,15 +3761,7 @@
         <w:keepLines/>
       </w:pPr>
       <w:r>
-        <w:t xml:space="preserve">1. Any work that requires, relies on or is referred to as </w:t>
-      </w:r>
-      <w:proofErr w:type="gramStart"/>
-      <w:r>
-        <w:t>factual information</w:t>
-      </w:r>
-      <w:proofErr w:type="gramEnd"/>
-      <w:r>
-        <w:t xml:space="preserve"> must be backed by sound evidence; research and sources must be provided wherever possible for human verification and evaluation. </w:t>
+        <w:t xml:space="preserve">1. Any work that requires, relies on or is referred to as factual information must be backed by sound evidence; research and sources must be provided wherever possible for human verification and evaluation. </w:t>
       </w:r>
     </w:p>
     <w:p>
@@ -4187,15 +3797,7 @@
         <w:keepLines/>
       </w:pPr>
       <w:r>
-        <w:t xml:space="preserve">5. When approvals, rejections and escalations are </w:t>
-      </w:r>
-      <w:proofErr w:type="gramStart"/>
-      <w:r>
-        <w:t>being conducted</w:t>
-      </w:r>
-      <w:proofErr w:type="gramEnd"/>
-      <w:r>
-        <w:t xml:space="preserve">, there must be clear, detailed, and traceable documentation. </w:t>
+        <w:t xml:space="preserve">5. When approvals, rejections and escalations are being conducted, there must be clear, detailed, and traceable documentation. </w:t>
       </w:r>
     </w:p>
     <w:p>
@@ -4216,18 +3818,7 @@
         <w:keepLines/>
       </w:pPr>
     </w:p>
-    <w:p>
-      <w:pPr>
-        <w:keepNext/>
-        <w:keepLines/>
-      </w:pPr>
-    </w:p>
-    <w:p>
-      <w:r>
-        <w:lastRenderedPageBreak/>
-        <w:br w:type="page"/>
-      </w:r>
-    </w:p>
+    <w:p/>
     <w:p>
       <w:pPr>
         <w:pStyle w:val="Heading3"/>
@@ -4712,7 +4303,21 @@
           <w:b/>
           <w:bCs/>
         </w:rPr>
-        <w:t>Updated on 30/8/2026</w:t>
+        <w:t>Updated on 30/</w:t>
+      </w:r>
+      <w:r>
+        <w:rPr>
+          <w:b/>
+          <w:bCs/>
+        </w:rPr>
+        <w:t>0</w:t>
+      </w:r>
+      <w:r>
+        <w:rPr>
+          <w:b/>
+          <w:bCs/>
+        </w:rPr>
+        <w:t>8/2026</w:t>
       </w:r>
     </w:p>
     <w:p>
@@ -4729,7 +4334,15 @@
       </w:r>
       <w:proofErr w:type="spellEnd"/>
       <w:r>
-        <w:t xml:space="preserve"> instead of ApsisVR.</w:t>
+        <w:t xml:space="preserve"> instead of </w:t>
+      </w:r>
+      <w:proofErr w:type="spellStart"/>
+      <w:r>
+        <w:t>ApsisVR</w:t>
+      </w:r>
+      <w:proofErr w:type="spellEnd"/>
+      <w:r>
+        <w:t>.</w:t>
       </w:r>
     </w:p>
     <w:p>
@@ -4749,6 +4362,16 @@
       <w:r>
         <w:t>3. Changed questions and assumptions for Ajith (Page 9)</w:t>
       </w:r>
+      <w:r>
+        <w:br/>
+      </w:r>
+      <w:r>
+        <w:rPr>
+          <w:b/>
+          <w:bCs/>
+        </w:rPr>
+        <w:t>Assumptions or Requirements that need clarification:</w:t>
+      </w:r>
     </w:p>
     <w:p>
       <w:pPr>
@@ -4756,14 +4379,14 @@
         <w:keepLines/>
       </w:pPr>
       <w:r>
-        <w:br/>
-      </w:r>
-      <w:r>
-        <w:rPr>
-          <w:b/>
-          <w:bCs/>
-        </w:rPr>
-        <w:t>Assumptions or Requirements that need clarification:</w:t>
+        <w:rPr>
+          <w:b/>
+          <w:bCs/>
+        </w:rPr>
+        <w:t>-</w:t>
+      </w:r>
+      <w:r>
+        <w:t>Threshold for escalation, what would minor, major or critical be defined as?</w:t>
       </w:r>
     </w:p>
     <w:p>
@@ -4771,38 +4394,36 @@
         <w:keepNext/>
         <w:keepLines/>
       </w:pPr>
-      <w:r>
-        <w:rPr>
-          <w:b/>
-          <w:bCs/>
-        </w:rPr>
-        <w:t>-</w:t>
-      </w:r>
-      <w:r>
-        <w:t>Threshold for escalation, what would minor, major or critical be defined as?</w:t>
-      </w:r>
     </w:p>
     <w:p>
       <w:pPr>
         <w:keepNext/>
         <w:keepLines/>
-      </w:pPr>
-    </w:p>
-    <w:p>
-      <w:pPr>
-        <w:keepNext/>
-        <w:keepLines/>
-        <w:rPr>
-          <w:b/>
-          <w:bCs/>
-        </w:rPr>
-      </w:pPr>
-      <w:r>
-        <w:rPr>
-          <w:b/>
-          <w:bCs/>
-        </w:rPr>
-        <w:t>Update on 9/9/2026</w:t>
+        <w:rPr>
+          <w:b/>
+          <w:bCs/>
+        </w:rPr>
+      </w:pPr>
+      <w:r>
+        <w:rPr>
+          <w:b/>
+          <w:bCs/>
+        </w:rPr>
+        <w:t>Update on 9/</w:t>
+      </w:r>
+      <w:r>
+        <w:rPr>
+          <w:b/>
+          <w:bCs/>
+        </w:rPr>
+        <w:t>0</w:t>
+      </w:r>
+      <w:r>
+        <w:rPr>
+          <w:b/>
+          <w:bCs/>
+        </w:rPr>
+        <w:t>9/2026</w:t>
       </w:r>
     </w:p>
     <w:p>
@@ -4812,8 +4433,12 @@
         <w:keepLines/>
         <w:numPr>
           <w:ilvl w:val="0"/>
-          <w:numId w:val="5"/>
+          <w:numId w:val="7"/>
         </w:numPr>
+        <w:rPr>
+          <w:b/>
+          <w:bCs/>
+        </w:rPr>
       </w:pPr>
       <w:r>
         <w:t>Added top 3 skills</w:t>
@@ -4826,7 +4451,7 @@
         <w:keepLines/>
         <w:numPr>
           <w:ilvl w:val="0"/>
-          <w:numId w:val="5"/>
+          <w:numId w:val="7"/>
         </w:numPr>
       </w:pPr>
       <w:r>
@@ -4840,7 +4465,7 @@
         <w:keepLines/>
         <w:numPr>
           <w:ilvl w:val="0"/>
-          <w:numId w:val="5"/>
+          <w:numId w:val="7"/>
         </w:numPr>
       </w:pPr>
       <w:r>
@@ -4854,7 +4479,7 @@
         <w:keepLines/>
         <w:numPr>
           <w:ilvl w:val="0"/>
-          <w:numId w:val="5"/>
+          <w:numId w:val="7"/>
         </w:numPr>
       </w:pPr>
       <w:r>
@@ -4868,6 +4493,10 @@
       <w:pPr>
         <w:keepNext/>
         <w:keepLines/>
+        <w:rPr>
+          <w:b/>
+          <w:bCs/>
+        </w:rPr>
       </w:pPr>
     </w:p>
     <w:p>
@@ -4910,6 +4539,95 @@
 <file path=word/numbering.xml><?xml version="1.0" encoding="utf-8"?>
 <w:numbering xmlns:wpc="http://schemas.microsoft.com/office/word/2010/wordprocessingCanvas" xmlns:cx="http://schemas.microsoft.com/office/drawing/2014/chartex" xmlns:cx1="http://schemas.microsoft.com/office/drawing/2015/9/8/chartex" xmlns:cx2="http://schemas.microsoft.com/office/drawing/2015/10/21/chartex" xmlns:cx3="http://schemas.microsoft.com/office/drawing/2016/5/9/chartex" xmlns:cx4="http://schemas.microsoft.com/office/drawing/2016/5/10/chartex" xmlns:cx5="http://schemas.microsoft.com/office/drawing/2016/5/11/chartex" xmlns:cx6="http://schemas.microsoft.com/office/drawing/2016/5/12/chartex" xmlns:cx7="http://schemas.microsoft.com/office/drawing/2016/5/13/chartex" xmlns:cx8="http://schemas.microsoft.com/office/drawing/2016/5/14/chartex" xmlns:mc="http://schemas.openxmlformats.org/markup-compatibility/2006" xmlns:aink="http://schemas.microsoft.com/office/drawing/2016/ink" xmlns:am3d="http://schemas.microsoft.com/office/drawing/2017/model3d" xmlns:o="urn:schemas-microsoft-com:office:office" xmlns:oel="http://schemas.microsoft.com/office/2019/extlst" xmlns:r="http://schemas.openxmlformats.org/officeDocument/2006/relationships" xmlns:m="http://schemas.openxmlformats.org/officeDocument/2006/math" xmlns:v="urn:schemas-microsoft-com:vml" xmlns:wp14="http://schemas.microsoft.com/office/word/2010/wordprocessingDrawing" xmlns:wp="http://schemas.openxmlformats.org/drawingml/2006/wordprocessingDrawing" xmlns:w10="urn:schemas-microsoft-com:office:word" xmlns:w="http://schemas.openxmlformats.org/wordprocessingml/2006/main" xmlns:w14="http://schemas.microsoft.com/office/word/2010/wordml" xmlns:w15="http://schemas.microsoft.com/office/word/2012/wordml" xmlns:w16cex="http://schemas.microsoft.com/office/word/2018/wordml/cex" xmlns:w16cid="http://schemas.microsoft.com/office/word/2016/wordml/cid" xmlns:w16="http://schemas.microsoft.com/office/word/2018/wordml" xmlns:w16du="http://schemas.microsoft.com/office/word/2023/wordml/word16du" xmlns:w16sdtdh="http://schemas.microsoft.com/office/word/2020/wordml/sdtdatahash" xmlns:w16sdtfl="http://schemas.microsoft.com/office/word/2024/wordml/sdtformatlock" xmlns:w16se="http://schemas.microsoft.com/office/word/2015/wordml/symex" xmlns:wpg="http://schemas.microsoft.com/office/word/2010/wordprocessingGroup" xmlns:wpi="http://schemas.microsoft.com/office/word/2010/wordprocessingInk" xmlns:wne="http://schemas.microsoft.com/office/word/2006/wordml" xmlns:wps="http://schemas.microsoft.com/office/word/2010/wordprocessingShape" mc:Ignorable="w14 w15 w16se w16cid w16 w16cex w16sdtdh w16sdtfl w16du wp14">
   <w:abstractNum w:abstractNumId="0" w15:restartNumberingAfterBreak="0">
+    <w:nsid w:val="0EBB5FBB"/>
+    <w:multiLevelType w:val="hybridMultilevel"/>
+    <w:tmpl w:val="C45EE448"/>
+    <w:lvl w:ilvl="0" w:tplc="0C09000F">
+      <w:start w:val="1"/>
+      <w:numFmt w:val="decimal"/>
+      <w:lvlText w:val="%1."/>
+      <w:lvlJc w:val="left"/>
+      <w:pPr>
+        <w:ind w:left="720" w:hanging="360"/>
+      </w:pPr>
+      <w:rPr>
+        <w:rFonts w:hint="default"/>
+      </w:rPr>
+    </w:lvl>
+    <w:lvl w:ilvl="1" w:tplc="0C090019" w:tentative="1">
+      <w:start w:val="1"/>
+      <w:numFmt w:val="lowerLetter"/>
+      <w:lvlText w:val="%2."/>
+      <w:lvlJc w:val="left"/>
+      <w:pPr>
+        <w:ind w:left="1440" w:hanging="360"/>
+      </w:pPr>
+    </w:lvl>
+    <w:lvl w:ilvl="2" w:tplc="0C09001B" w:tentative="1">
+      <w:start w:val="1"/>
+      <w:numFmt w:val="lowerRoman"/>
+      <w:lvlText w:val="%3."/>
+      <w:lvlJc w:val="right"/>
+      <w:pPr>
+        <w:ind w:left="2160" w:hanging="180"/>
+      </w:pPr>
+    </w:lvl>
+    <w:lvl w:ilvl="3" w:tplc="0C09000F" w:tentative="1">
+      <w:start w:val="1"/>
+      <w:numFmt w:val="decimal"/>
+      <w:lvlText w:val="%4."/>
+      <w:lvlJc w:val="left"/>
+      <w:pPr>
+        <w:ind w:left="2880" w:hanging="360"/>
+      </w:pPr>
+    </w:lvl>
+    <w:lvl w:ilvl="4" w:tplc="0C090019" w:tentative="1">
+      <w:start w:val="1"/>
+      <w:numFmt w:val="lowerLetter"/>
+      <w:lvlText w:val="%5."/>
+      <w:lvlJc w:val="left"/>
+      <w:pPr>
+        <w:ind w:left="3600" w:hanging="360"/>
+      </w:pPr>
+    </w:lvl>
+    <w:lvl w:ilvl="5" w:tplc="0C09001B" w:tentative="1">
+      <w:start w:val="1"/>
+      <w:numFmt w:val="lowerRoman"/>
+      <w:lvlText w:val="%6."/>
+      <w:lvlJc w:val="right"/>
+      <w:pPr>
+        <w:ind w:left="4320" w:hanging="180"/>
+      </w:pPr>
+    </w:lvl>
+    <w:lvl w:ilvl="6" w:tplc="0C09000F" w:tentative="1">
+      <w:start w:val="1"/>
+      <w:numFmt w:val="decimal"/>
+      <w:lvlText w:val="%7."/>
+      <w:lvlJc w:val="left"/>
+      <w:pPr>
+        <w:ind w:left="5040" w:hanging="360"/>
+      </w:pPr>
+    </w:lvl>
+    <w:lvl w:ilvl="7" w:tplc="0C090019" w:tentative="1">
+      <w:start w:val="1"/>
+      <w:numFmt w:val="lowerLetter"/>
+      <w:lvlText w:val="%8."/>
+      <w:lvlJc w:val="left"/>
+      <w:pPr>
+        <w:ind w:left="5760" w:hanging="360"/>
+      </w:pPr>
+    </w:lvl>
+    <w:lvl w:ilvl="8" w:tplc="0C09001B" w:tentative="1">
+      <w:start w:val="1"/>
+      <w:numFmt w:val="lowerRoman"/>
+      <w:lvlText w:val="%9."/>
+      <w:lvlJc w:val="right"/>
+      <w:pPr>
+        <w:ind w:left="6480" w:hanging="180"/>
+      </w:pPr>
+    </w:lvl>
+  </w:abstractNum>
+  <w:abstractNum w:abstractNumId="1" w15:restartNumberingAfterBreak="0">
     <w:nsid w:val="102ACC37"/>
     <w:multiLevelType w:val="hybridMultilevel"/>
     <w:tmpl w:val="8438D954"/>
@@ -5022,7 +4740,120 @@
       </w:rPr>
     </w:lvl>
   </w:abstractNum>
-  <w:abstractNum w:abstractNumId="1" w15:restartNumberingAfterBreak="0">
+  <w:abstractNum w:abstractNumId="2" w15:restartNumberingAfterBreak="0">
+    <w:nsid w:val="244942D5"/>
+    <w:multiLevelType w:val="hybridMultilevel"/>
+    <w:tmpl w:val="56A43AD4"/>
+    <w:lvl w:ilvl="0" w:tplc="DECA71F6">
+      <w:start w:val="1"/>
+      <w:numFmt w:val="bullet"/>
+      <w:lvlText w:val=""/>
+      <w:lvlJc w:val="left"/>
+      <w:pPr>
+        <w:ind w:left="720" w:hanging="360"/>
+      </w:pPr>
+      <w:rPr>
+        <w:rFonts w:ascii="Symbol" w:eastAsia="Aptos" w:hAnsi="Symbol" w:cs="Aptos" w:hint="default"/>
+      </w:rPr>
+    </w:lvl>
+    <w:lvl w:ilvl="1" w:tplc="0C090003" w:tentative="1">
+      <w:start w:val="1"/>
+      <w:numFmt w:val="bullet"/>
+      <w:lvlText w:val="o"/>
+      <w:lvlJc w:val="left"/>
+      <w:pPr>
+        <w:ind w:left="1440" w:hanging="360"/>
+      </w:pPr>
+      <w:rPr>
+        <w:rFonts w:ascii="Courier New" w:hAnsi="Courier New" w:cs="Courier New" w:hint="default"/>
+      </w:rPr>
+    </w:lvl>
+    <w:lvl w:ilvl="2" w:tplc="0C090005" w:tentative="1">
+      <w:start w:val="1"/>
+      <w:numFmt w:val="bullet"/>
+      <w:lvlText w:val=""/>
+      <w:lvlJc w:val="left"/>
+      <w:pPr>
+        <w:ind w:left="2160" w:hanging="360"/>
+      </w:pPr>
+      <w:rPr>
+        <w:rFonts w:ascii="Wingdings" w:hAnsi="Wingdings" w:hint="default"/>
+      </w:rPr>
+    </w:lvl>
+    <w:lvl w:ilvl="3" w:tplc="0C090001" w:tentative="1">
+      <w:start w:val="1"/>
+      <w:numFmt w:val="bullet"/>
+      <w:lvlText w:val=""/>
+      <w:lvlJc w:val="left"/>
+      <w:pPr>
+        <w:ind w:left="2880" w:hanging="360"/>
+      </w:pPr>
+      <w:rPr>
+        <w:rFonts w:ascii="Symbol" w:hAnsi="Symbol" w:hint="default"/>
+      </w:rPr>
+    </w:lvl>
+    <w:lvl w:ilvl="4" w:tplc="0C090003" w:tentative="1">
+      <w:start w:val="1"/>
+      <w:numFmt w:val="bullet"/>
+      <w:lvlText w:val="o"/>
+      <w:lvlJc w:val="left"/>
+      <w:pPr>
+        <w:ind w:left="3600" w:hanging="360"/>
+      </w:pPr>
+      <w:rPr>
+        <w:rFonts w:ascii="Courier New" w:hAnsi="Courier New" w:cs="Courier New" w:hint="default"/>
+      </w:rPr>
+    </w:lvl>
+    <w:lvl w:ilvl="5" w:tplc="0C090005" w:tentative="1">
+      <w:start w:val="1"/>
+      <w:numFmt w:val="bullet"/>
+      <w:lvlText w:val=""/>
+      <w:lvlJc w:val="left"/>
+      <w:pPr>
+        <w:ind w:left="4320" w:hanging="360"/>
+      </w:pPr>
+      <w:rPr>
+        <w:rFonts w:ascii="Wingdings" w:hAnsi="Wingdings" w:hint="default"/>
+      </w:rPr>
+    </w:lvl>
+    <w:lvl w:ilvl="6" w:tplc="0C090001" w:tentative="1">
+      <w:start w:val="1"/>
+      <w:numFmt w:val="bullet"/>
+      <w:lvlText w:val=""/>
+      <w:lvlJc w:val="left"/>
+      <w:pPr>
+        <w:ind w:left="5040" w:hanging="360"/>
+      </w:pPr>
+      <w:rPr>
+        <w:rFonts w:ascii="Symbol" w:hAnsi="Symbol" w:hint="default"/>
+      </w:rPr>
+    </w:lvl>
+    <w:lvl w:ilvl="7" w:tplc="0C090003" w:tentative="1">
+      <w:start w:val="1"/>
+      <w:numFmt w:val="bullet"/>
+      <w:lvlText w:val="o"/>
+      <w:lvlJc w:val="left"/>
+      <w:pPr>
+        <w:ind w:left="5760" w:hanging="360"/>
+      </w:pPr>
+      <w:rPr>
+        <w:rFonts w:ascii="Courier New" w:hAnsi="Courier New" w:cs="Courier New" w:hint="default"/>
+      </w:rPr>
+    </w:lvl>
+    <w:lvl w:ilvl="8" w:tplc="0C090005" w:tentative="1">
+      <w:start w:val="1"/>
+      <w:numFmt w:val="bullet"/>
+      <w:lvlText w:val=""/>
+      <w:lvlJc w:val="left"/>
+      <w:pPr>
+        <w:ind w:left="6480" w:hanging="360"/>
+      </w:pPr>
+      <w:rPr>
+        <w:rFonts w:ascii="Wingdings" w:hAnsi="Wingdings" w:hint="default"/>
+      </w:rPr>
+    </w:lvl>
+  </w:abstractNum>
+  <w:abstractNum w:abstractNumId="3" w15:restartNumberingAfterBreak="0">
     <w:nsid w:val="2659836D"/>
     <w:multiLevelType w:val="hybridMultilevel"/>
     <w:tmpl w:val="068C8990"/>
@@ -5108,7 +4939,7 @@
       </w:pPr>
     </w:lvl>
   </w:abstractNum>
-  <w:abstractNum w:abstractNumId="2" w15:restartNumberingAfterBreak="0">
+  <w:abstractNum w:abstractNumId="4" w15:restartNumberingAfterBreak="0">
     <w:nsid w:val="2CCABB48"/>
     <w:multiLevelType w:val="hybridMultilevel"/>
     <w:tmpl w:val="71487766"/>
@@ -5221,7 +5052,233 @@
       </w:rPr>
     </w:lvl>
   </w:abstractNum>
-  <w:abstractNum w:abstractNumId="3" w15:restartNumberingAfterBreak="0">
+  <w:abstractNum w:abstractNumId="5" w15:restartNumberingAfterBreak="0">
+    <w:nsid w:val="3DEE2413"/>
+    <w:multiLevelType w:val="hybridMultilevel"/>
+    <w:tmpl w:val="9724D0B0"/>
+    <w:lvl w:ilvl="0" w:tplc="B2B6822E">
+      <w:start w:val="10"/>
+      <w:numFmt w:val="bullet"/>
+      <w:lvlText w:val="-"/>
+      <w:lvlJc w:val="left"/>
+      <w:pPr>
+        <w:ind w:left="720" w:hanging="360"/>
+      </w:pPr>
+      <w:rPr>
+        <w:rFonts w:ascii="Aptos" w:eastAsiaTheme="minorEastAsia" w:hAnsi="Aptos" w:cstheme="minorBidi" w:hint="default"/>
+      </w:rPr>
+    </w:lvl>
+    <w:lvl w:ilvl="1" w:tplc="0C090003" w:tentative="1">
+      <w:start w:val="1"/>
+      <w:numFmt w:val="bullet"/>
+      <w:lvlText w:val="o"/>
+      <w:lvlJc w:val="left"/>
+      <w:pPr>
+        <w:ind w:left="1440" w:hanging="360"/>
+      </w:pPr>
+      <w:rPr>
+        <w:rFonts w:ascii="Courier New" w:hAnsi="Courier New" w:cs="Courier New" w:hint="default"/>
+      </w:rPr>
+    </w:lvl>
+    <w:lvl w:ilvl="2" w:tplc="0C090005" w:tentative="1">
+      <w:start w:val="1"/>
+      <w:numFmt w:val="bullet"/>
+      <w:lvlText w:val=""/>
+      <w:lvlJc w:val="left"/>
+      <w:pPr>
+        <w:ind w:left="2160" w:hanging="360"/>
+      </w:pPr>
+      <w:rPr>
+        <w:rFonts w:ascii="Wingdings" w:hAnsi="Wingdings" w:hint="default"/>
+      </w:rPr>
+    </w:lvl>
+    <w:lvl w:ilvl="3" w:tplc="0C090001" w:tentative="1">
+      <w:start w:val="1"/>
+      <w:numFmt w:val="bullet"/>
+      <w:lvlText w:val=""/>
+      <w:lvlJc w:val="left"/>
+      <w:pPr>
+        <w:ind w:left="2880" w:hanging="360"/>
+      </w:pPr>
+      <w:rPr>
+        <w:rFonts w:ascii="Symbol" w:hAnsi="Symbol" w:hint="default"/>
+      </w:rPr>
+    </w:lvl>
+    <w:lvl w:ilvl="4" w:tplc="0C090003" w:tentative="1">
+      <w:start w:val="1"/>
+      <w:numFmt w:val="bullet"/>
+      <w:lvlText w:val="o"/>
+      <w:lvlJc w:val="left"/>
+      <w:pPr>
+        <w:ind w:left="3600" w:hanging="360"/>
+      </w:pPr>
+      <w:rPr>
+        <w:rFonts w:ascii="Courier New" w:hAnsi="Courier New" w:cs="Courier New" w:hint="default"/>
+      </w:rPr>
+    </w:lvl>
+    <w:lvl w:ilvl="5" w:tplc="0C090005" w:tentative="1">
+      <w:start w:val="1"/>
+      <w:numFmt w:val="bullet"/>
+      <w:lvlText w:val=""/>
+      <w:lvlJc w:val="left"/>
+      <w:pPr>
+        <w:ind w:left="4320" w:hanging="360"/>
+      </w:pPr>
+      <w:rPr>
+        <w:rFonts w:ascii="Wingdings" w:hAnsi="Wingdings" w:hint="default"/>
+      </w:rPr>
+    </w:lvl>
+    <w:lvl w:ilvl="6" w:tplc="0C090001" w:tentative="1">
+      <w:start w:val="1"/>
+      <w:numFmt w:val="bullet"/>
+      <w:lvlText w:val=""/>
+      <w:lvlJc w:val="left"/>
+      <w:pPr>
+        <w:ind w:left="5040" w:hanging="360"/>
+      </w:pPr>
+      <w:rPr>
+        <w:rFonts w:ascii="Symbol" w:hAnsi="Symbol" w:hint="default"/>
+      </w:rPr>
+    </w:lvl>
+    <w:lvl w:ilvl="7" w:tplc="0C090003" w:tentative="1">
+      <w:start w:val="1"/>
+      <w:numFmt w:val="bullet"/>
+      <w:lvlText w:val="o"/>
+      <w:lvlJc w:val="left"/>
+      <w:pPr>
+        <w:ind w:left="5760" w:hanging="360"/>
+      </w:pPr>
+      <w:rPr>
+        <w:rFonts w:ascii="Courier New" w:hAnsi="Courier New" w:cs="Courier New" w:hint="default"/>
+      </w:rPr>
+    </w:lvl>
+    <w:lvl w:ilvl="8" w:tplc="0C090005" w:tentative="1">
+      <w:start w:val="1"/>
+      <w:numFmt w:val="bullet"/>
+      <w:lvlText w:val=""/>
+      <w:lvlJc w:val="left"/>
+      <w:pPr>
+        <w:ind w:left="6480" w:hanging="360"/>
+      </w:pPr>
+      <w:rPr>
+        <w:rFonts w:ascii="Wingdings" w:hAnsi="Wingdings" w:hint="default"/>
+      </w:rPr>
+    </w:lvl>
+  </w:abstractNum>
+  <w:abstractNum w:abstractNumId="6" w15:restartNumberingAfterBreak="0">
+    <w:nsid w:val="4D6862CB"/>
+    <w:multiLevelType w:val="hybridMultilevel"/>
+    <w:tmpl w:val="772410E8"/>
+    <w:lvl w:ilvl="0" w:tplc="CBEE1CA6">
+      <w:start w:val="1"/>
+      <w:numFmt w:val="bullet"/>
+      <w:lvlText w:val="-"/>
+      <w:lvlJc w:val="left"/>
+      <w:pPr>
+        <w:ind w:left="720" w:hanging="360"/>
+      </w:pPr>
+      <w:rPr>
+        <w:rFonts w:ascii="Aptos" w:eastAsiaTheme="minorEastAsia" w:hAnsi="Aptos" w:cstheme="minorBidi" w:hint="default"/>
+      </w:rPr>
+    </w:lvl>
+    <w:lvl w:ilvl="1" w:tplc="0C090003" w:tentative="1">
+      <w:start w:val="1"/>
+      <w:numFmt w:val="bullet"/>
+      <w:lvlText w:val="o"/>
+      <w:lvlJc w:val="left"/>
+      <w:pPr>
+        <w:ind w:left="1440" w:hanging="360"/>
+      </w:pPr>
+      <w:rPr>
+        <w:rFonts w:ascii="Courier New" w:hAnsi="Courier New" w:cs="Courier New" w:hint="default"/>
+      </w:rPr>
+    </w:lvl>
+    <w:lvl w:ilvl="2" w:tplc="0C090005" w:tentative="1">
+      <w:start w:val="1"/>
+      <w:numFmt w:val="bullet"/>
+      <w:lvlText w:val=""/>
+      <w:lvlJc w:val="left"/>
+      <w:pPr>
+        <w:ind w:left="2160" w:hanging="360"/>
+      </w:pPr>
+      <w:rPr>
+        <w:rFonts w:ascii="Wingdings" w:hAnsi="Wingdings" w:hint="default"/>
+      </w:rPr>
+    </w:lvl>
+    <w:lvl w:ilvl="3" w:tplc="0C090001" w:tentative="1">
+      <w:start w:val="1"/>
+      <w:numFmt w:val="bullet"/>
+      <w:lvlText w:val=""/>
+      <w:lvlJc w:val="left"/>
+      <w:pPr>
+        <w:ind w:left="2880" w:hanging="360"/>
+      </w:pPr>
+      <w:rPr>
+        <w:rFonts w:ascii="Symbol" w:hAnsi="Symbol" w:hint="default"/>
+      </w:rPr>
+    </w:lvl>
+    <w:lvl w:ilvl="4" w:tplc="0C090003" w:tentative="1">
+      <w:start w:val="1"/>
+      <w:numFmt w:val="bullet"/>
+      <w:lvlText w:val="o"/>
+      <w:lvlJc w:val="left"/>
+      <w:pPr>
+        <w:ind w:left="3600" w:hanging="360"/>
+      </w:pPr>
+      <w:rPr>
+        <w:rFonts w:ascii="Courier New" w:hAnsi="Courier New" w:cs="Courier New" w:hint="default"/>
+      </w:rPr>
+    </w:lvl>
+    <w:lvl w:ilvl="5" w:tplc="0C090005" w:tentative="1">
+      <w:start w:val="1"/>
+      <w:numFmt w:val="bullet"/>
+      <w:lvlText w:val=""/>
+      <w:lvlJc w:val="left"/>
+      <w:pPr>
+        <w:ind w:left="4320" w:hanging="360"/>
+      </w:pPr>
+      <w:rPr>
+        <w:rFonts w:ascii="Wingdings" w:hAnsi="Wingdings" w:hint="default"/>
+      </w:rPr>
+    </w:lvl>
+    <w:lvl w:ilvl="6" w:tplc="0C090001" w:tentative="1">
+      <w:start w:val="1"/>
+      <w:numFmt w:val="bullet"/>
+      <w:lvlText w:val=""/>
+      <w:lvlJc w:val="left"/>
+      <w:pPr>
+        <w:ind w:left="5040" w:hanging="360"/>
+      </w:pPr>
+      <w:rPr>
+        <w:rFonts w:ascii="Symbol" w:hAnsi="Symbol" w:hint="default"/>
+      </w:rPr>
+    </w:lvl>
+    <w:lvl w:ilvl="7" w:tplc="0C090003" w:tentative="1">
+      <w:start w:val="1"/>
+      <w:numFmt w:val="bullet"/>
+      <w:lvlText w:val="o"/>
+      <w:lvlJc w:val="left"/>
+      <w:pPr>
+        <w:ind w:left="5760" w:hanging="360"/>
+      </w:pPr>
+      <w:rPr>
+        <w:rFonts w:ascii="Courier New" w:hAnsi="Courier New" w:cs="Courier New" w:hint="default"/>
+      </w:rPr>
+    </w:lvl>
+    <w:lvl w:ilvl="8" w:tplc="0C090005" w:tentative="1">
+      <w:start w:val="1"/>
+      <w:numFmt w:val="bullet"/>
+      <w:lvlText w:val=""/>
+      <w:lvlJc w:val="left"/>
+      <w:pPr>
+        <w:ind w:left="6480" w:hanging="360"/>
+      </w:pPr>
+      <w:rPr>
+        <w:rFonts w:ascii="Wingdings" w:hAnsi="Wingdings" w:hint="default"/>
+      </w:rPr>
+    </w:lvl>
+  </w:abstractNum>
+  <w:abstractNum w:abstractNumId="7" w15:restartNumberingAfterBreak="0">
     <w:nsid w:val="65EBFF9A"/>
     <w:multiLevelType w:val="hybridMultilevel"/>
     <w:tmpl w:val="3834A832"/>
@@ -5334,7 +5391,7 @@
       </w:rPr>
     </w:lvl>
   </w:abstractNum>
-  <w:abstractNum w:abstractNumId="4" w15:restartNumberingAfterBreak="0">
+  <w:abstractNum w:abstractNumId="8" w15:restartNumberingAfterBreak="0">
     <w:nsid w:val="70EBAC33"/>
     <w:multiLevelType w:val="hybridMultilevel"/>
     <w:tmpl w:val="307A0354"/>
@@ -5448,19 +5505,31 @@
     </w:lvl>
   </w:abstractNum>
   <w:num w:numId="1" w16cid:durableId="387992325">
-    <w:abstractNumId w:val="2"/>
+    <w:abstractNumId w:val="4"/>
   </w:num>
   <w:num w:numId="2" w16cid:durableId="1987390204">
+    <w:abstractNumId w:val="7"/>
+  </w:num>
+  <w:num w:numId="3" w16cid:durableId="947082334">
+    <w:abstractNumId w:val="8"/>
+  </w:num>
+  <w:num w:numId="4" w16cid:durableId="1145971357">
+    <w:abstractNumId w:val="1"/>
+  </w:num>
+  <w:num w:numId="5" w16cid:durableId="659650871">
     <w:abstractNumId w:val="3"/>
   </w:num>
-  <w:num w:numId="3" w16cid:durableId="947082334">
-    <w:abstractNumId w:val="4"/>
+  <w:num w:numId="6" w16cid:durableId="236794501">
+    <w:abstractNumId w:val="5"/>
   </w:num>
-  <w:num w:numId="4" w16cid:durableId="1145971357">
+  <w:num w:numId="7" w16cid:durableId="1521166047">
+    <w:abstractNumId w:val="6"/>
+  </w:num>
+  <w:num w:numId="8" w16cid:durableId="1758986785">
     <w:abstractNumId w:val="0"/>
   </w:num>
-  <w:num w:numId="5" w16cid:durableId="659650871">
-    <w:abstractNumId w:val="1"/>
+  <w:num w:numId="9" w16cid:durableId="335692313">
+    <w:abstractNumId w:val="2"/>
   </w:num>
 </w:numbering>
 </file>
@@ -5863,6 +5932,7 @@
   <w:style w:type="paragraph" w:default="1" w:styleId="Normal">
     <w:name w:val="Normal"/>
     <w:qFormat/>
+    <w:rsid w:val="00575834"/>
   </w:style>
   <w:style w:type="paragraph" w:styleId="Heading1">
     <w:name w:val="heading 1"/>
@@ -6301,21 +6371,6 @@
 </file>
 
 <file path=customXml/item1.xml><?xml version="1.0" encoding="utf-8"?>
-<?mso-contentType ?>
-<FormTemplates xmlns="http://schemas.microsoft.com/sharepoint/v3/contenttype/forms">
-  <Display>DocumentLibraryForm</Display>
-  <Edit>DocumentLibraryForm</Edit>
-  <New>DocumentLibraryForm</New>
-</FormTemplates>
-</file>
-
-<file path=customXml/item2.xml><?xml version="1.0" encoding="utf-8"?>
-<p:properties xmlns:p="http://schemas.microsoft.com/office/2006/metadata/properties" xmlns:xsi="http://www.w3.org/2001/XMLSchema-instance" xmlns:pc="http://schemas.microsoft.com/office/infopath/2007/PartnerControls">
-  <documentManagement/>
-</p:properties>
-</file>
-
-<file path=customXml/item3.xml><?xml version="1.0" encoding="utf-8"?>
 <ct:contentTypeSchema xmlns:ct="http://schemas.microsoft.com/office/2006/metadata/contentType" xmlns:ma="http://schemas.microsoft.com/office/2006/metadata/properties/metaAttributes" ct:_="" ma:_="" ma:contentTypeName="Document" ma:contentTypeID="0x01010032B022E3FFE7534CAF83618C1EF3FEC2" ma:contentTypeVersion="7" ma:contentTypeDescription="Create a new document." ma:contentTypeScope="" ma:versionID="a897cb37286d26e47733ead3964d5330">
   <xsd:schema xmlns:xsd="http://www.w3.org/2001/XMLSchema" xmlns:xs="http://www.w3.org/2001/XMLSchema" xmlns:p="http://schemas.microsoft.com/office/2006/metadata/properties" xmlns:ns2="01d5e555-494a-40ad-b5bc-1378a5d8ad0d" targetNamespace="http://schemas.microsoft.com/office/2006/metadata/properties" ma:root="true" ma:fieldsID="5cfa18463ebd691bd1329ef9a11c56e8" ns2:_="">
     <xsd:import namespace="01d5e555-494a-40ad-b5bc-1378a5d8ad0d"/>
@@ -6477,24 +6532,22 @@
 </ct:contentTypeSchema>
 </file>
 
-<file path=customXml/itemProps1.xml><?xml version="1.0" encoding="utf-8"?>
-<ds:datastoreItem xmlns:ds="http://schemas.openxmlformats.org/officeDocument/2006/customXml" ds:itemID="{AEFB4E47-FC17-4A16-B0E3-32CC31B513A4}">
-  <ds:schemaRefs>
-    <ds:schemaRef ds:uri="http://schemas.microsoft.com/sharepoint/v3/contenttype/forms"/>
-  </ds:schemaRefs>
-</ds:datastoreItem>
+<file path=customXml/item2.xml><?xml version="1.0" encoding="utf-8"?>
+<p:properties xmlns:p="http://schemas.microsoft.com/office/2006/metadata/properties" xmlns:xsi="http://www.w3.org/2001/XMLSchema-instance" xmlns:pc="http://schemas.microsoft.com/office/infopath/2007/PartnerControls">
+  <documentManagement/>
+</p:properties>
 </file>
 
-<file path=customXml/itemProps2.xml><?xml version="1.0" encoding="utf-8"?>
-<ds:datastoreItem xmlns:ds="http://schemas.openxmlformats.org/officeDocument/2006/customXml" ds:itemID="{C2BDD9E7-F7A9-435B-BDC0-31F82AEEBD6D}">
-  <ds:schemaRefs>
-    <ds:schemaRef ds:uri="http://schemas.microsoft.com/office/2006/metadata/properties"/>
-    <ds:schemaRef ds:uri="http://schemas.microsoft.com/office/infopath/2007/PartnerControls"/>
-  </ds:schemaRefs>
-</ds:datastoreItem>
+<file path=customXml/item3.xml><?xml version="1.0" encoding="utf-8"?>
+<?mso-contentType ?>
+<FormTemplates xmlns="http://schemas.microsoft.com/sharepoint/v3/contenttype/forms">
+  <Display>DocumentLibraryForm</Display>
+  <Edit>DocumentLibraryForm</Edit>
+  <New>DocumentLibraryForm</New>
+</FormTemplates>
 </file>
 
-<file path=customXml/itemProps3.xml><?xml version="1.0" encoding="utf-8"?>
+<file path=customXml/itemProps1.xml><?xml version="1.0" encoding="utf-8"?>
 <ds:datastoreItem xmlns:ds="http://schemas.openxmlformats.org/officeDocument/2006/customXml" ds:itemID="{23C5D5E2-8E84-4D20-9A8C-93ACABE40A25}">
   <ds:schemaRefs>
     <ds:schemaRef ds:uri="http://schemas.microsoft.com/office/2006/metadata/contentType"/>
@@ -6510,4 +6563,21 @@
     <ds:schemaRef ds:uri="http://schemas.microsoft.com/internal/obd"/>
   </ds:schemaRefs>
 </ds:datastoreItem>
+</file>
+
+<file path=customXml/itemProps2.xml><?xml version="1.0" encoding="utf-8"?>
+<ds:datastoreItem xmlns:ds="http://schemas.openxmlformats.org/officeDocument/2006/customXml" ds:itemID="{C2BDD9E7-F7A9-435B-BDC0-31F82AEEBD6D}">
+  <ds:schemaRefs>
+    <ds:schemaRef ds:uri="http://schemas.microsoft.com/office/2006/metadata/properties"/>
+    <ds:schemaRef ds:uri="http://schemas.microsoft.com/office/infopath/2007/PartnerControls"/>
+  </ds:schemaRefs>
+</ds:datastoreItem>
+</file>
+
+<file path=customXml/itemProps3.xml><?xml version="1.0" encoding="utf-8"?>
+<ds:datastoreItem xmlns:ds="http://schemas.openxmlformats.org/officeDocument/2006/customXml" ds:itemID="{AEFB4E47-FC17-4A16-B0E3-32CC31B513A4}">
+  <ds:schemaRefs>
+    <ds:schemaRef ds:uri="http://schemas.microsoft.com/sharepoint/v3/contenttype/forms"/>
+  </ds:schemaRefs>
+</ds:datastoreItem>
 </file>
</xml_diff>

<commit_message>
docs: Added HP-002, HP-003 reports as well as the validaiton report. Updated Authoirty Manager AI Agent with changes to AI Agent
</commit_message>
<xml_diff>
--- a/docs/AI-Role-Specification/Authority_Manager_Agent_Specification.docx
+++ b/docs/AI-Role-Specification/Authority_Manager_Agent_Specification.docx
@@ -191,14 +191,7 @@
           <w:rFonts w:ascii="Aptos" w:eastAsia="Aptos" w:hAnsi="Aptos" w:cs="Aptos"/>
           <w:color w:val="000000" w:themeColor="text1"/>
         </w:rPr>
-        <w:t>1</w:t>
-      </w:r>
-      <w:r>
-        <w:rPr>
-          <w:rFonts w:ascii="Aptos" w:eastAsia="Aptos" w:hAnsi="Aptos" w:cs="Aptos"/>
-          <w:color w:val="000000" w:themeColor="text1"/>
-        </w:rPr>
-        <w:t>6</w:t>
+        <w:t>22</w:t>
       </w:r>
       <w:r>
         <w:rPr>
@@ -297,39 +290,7 @@
           <w:rFonts w:ascii="Aptos" w:eastAsia="Aptos" w:hAnsi="Aptos" w:cs="Aptos"/>
           <w:color w:val="000000" w:themeColor="text1"/>
         </w:rPr>
-        <w:t xml:space="preserve">The Authority Manager will strengthen </w:t>
-      </w:r>
-      <w:proofErr w:type="spellStart"/>
-      <w:r>
-        <w:rPr>
-          <w:rFonts w:ascii="Aptos" w:eastAsia="Aptos" w:hAnsi="Aptos" w:cs="Aptos"/>
-          <w:color w:val="000000" w:themeColor="text1"/>
-        </w:rPr>
-        <w:t>ViriVR’s</w:t>
-      </w:r>
-      <w:proofErr w:type="spellEnd"/>
-      <w:r>
-        <w:rPr>
-          <w:rFonts w:ascii="Aptos" w:eastAsia="Aptos" w:hAnsi="Aptos" w:cs="Aptos"/>
-          <w:color w:val="000000" w:themeColor="text1"/>
-        </w:rPr>
-        <w:t xml:space="preserve"> external trust, citations, links, brand presence, domain authority through the management of its AI agents; the Digital PR Specialist, the Backlink Auditor and the Brand Authority Builder. By overseeing and coordinating them, the Authority Manager will ensure the AI agents will contribute to </w:t>
-      </w:r>
-      <w:proofErr w:type="spellStart"/>
-      <w:r>
-        <w:rPr>
-          <w:rFonts w:ascii="Aptos" w:eastAsia="Aptos" w:hAnsi="Aptos" w:cs="Aptos"/>
-          <w:color w:val="000000" w:themeColor="text1"/>
-        </w:rPr>
-        <w:t>ViriVR’s</w:t>
-      </w:r>
-      <w:proofErr w:type="spellEnd"/>
-      <w:r>
-        <w:rPr>
-          <w:rFonts w:ascii="Aptos" w:eastAsia="Aptos" w:hAnsi="Aptos" w:cs="Aptos"/>
-          <w:color w:val="000000" w:themeColor="text1"/>
-        </w:rPr>
-        <w:t xml:space="preserve"> authority goals and objectives and provide successful business outcomes.</w:t>
+        <w:t>The Authority Manager will strengthen ViriVR’s external trust, citations, links, brand presence, domain authority through the management of its AI agents; the Digital PR Specialist, the Backlink Auditor and the Brand Authority Builder. By overseeing and coordinating them, the Authority Manager will ensure the AI agents will contribute to ViriVR’s authority goals and objectives and provide successful business outcomes.</w:t>
       </w:r>
     </w:p>
     <w:p>
@@ -371,39 +332,7 @@
           <w:rFonts w:ascii="Aptos" w:eastAsia="Aptos" w:hAnsi="Aptos" w:cs="Aptos"/>
           <w:color w:val="000000" w:themeColor="text1"/>
         </w:rPr>
-        <w:t xml:space="preserve">This continuous process of approval, reviewing and monitoring of the AI agents and its outputs will help ensure their ability to produce quality, reliable, and research-based outcomes for </w:t>
-      </w:r>
-      <w:proofErr w:type="spellStart"/>
-      <w:r>
-        <w:rPr>
-          <w:rFonts w:ascii="Aptos" w:eastAsia="Aptos" w:hAnsi="Aptos" w:cs="Aptos"/>
-          <w:color w:val="000000" w:themeColor="text1"/>
-        </w:rPr>
-        <w:t>ViriVR</w:t>
-      </w:r>
-      <w:proofErr w:type="spellEnd"/>
-      <w:r>
-        <w:rPr>
-          <w:rFonts w:ascii="Aptos" w:eastAsia="Aptos" w:hAnsi="Aptos" w:cs="Aptos"/>
-          <w:color w:val="000000" w:themeColor="text1"/>
-        </w:rPr>
-        <w:t xml:space="preserve">. This will increase the business’s external trust, increasing opportunities for the business to be cited or linked to relevant domains and will ultimately result in increasing </w:t>
-      </w:r>
-      <w:proofErr w:type="spellStart"/>
-      <w:r>
-        <w:rPr>
-          <w:rFonts w:ascii="Aptos" w:eastAsia="Aptos" w:hAnsi="Aptos" w:cs="Aptos"/>
-          <w:color w:val="000000" w:themeColor="text1"/>
-        </w:rPr>
-        <w:t>ViriVR’s</w:t>
-      </w:r>
-      <w:proofErr w:type="spellEnd"/>
-      <w:r>
-        <w:rPr>
-          <w:rFonts w:ascii="Aptos" w:eastAsia="Aptos" w:hAnsi="Aptos" w:cs="Aptos"/>
-          <w:color w:val="000000" w:themeColor="text1"/>
-        </w:rPr>
-        <w:t xml:space="preserve"> visibility, credibility, brand presence, and domain authority.</w:t>
+        <w:t>This continuous process of approval, reviewing and monitoring of the AI agents and its outputs will help ensure their ability to produce quality, reliable, and research-based outcomes for ViriVR. This will increase the business’s external trust, increasing opportunities for the business to be cited or linked to relevant domains and will ultimately result in increasing ViriVR’s visibility, credibility, brand presence, and domain authority.</w:t>
       </w:r>
     </w:p>
     <w:p>
@@ -939,7 +868,6 @@
               </w:rPr>
               <w:t xml:space="preserve">Check if AI agents recommendations and contributed to improving </w:t>
             </w:r>
-            <w:proofErr w:type="spellStart"/>
             <w:r>
               <w:rPr>
                 <w:rFonts w:ascii="Aptos" w:eastAsia="Aptos" w:hAnsi="Aptos" w:cs="Aptos"/>
@@ -951,14 +879,7 @@
               <w:rPr>
                 <w:rFonts w:ascii="Aptos" w:eastAsia="Aptos" w:hAnsi="Aptos" w:cs="Aptos"/>
               </w:rPr>
-              <w:t>‘s</w:t>
-            </w:r>
-            <w:proofErr w:type="spellEnd"/>
-            <w:r>
-              <w:rPr>
-                <w:rFonts w:ascii="Aptos" w:eastAsia="Aptos" w:hAnsi="Aptos" w:cs="Aptos"/>
-              </w:rPr>
-              <w:t xml:space="preserve"> domain authority, visibility and increased traffic</w:t>
+              <w:t>‘s domain authority, visibility and increased traffic</w:t>
             </w:r>
           </w:p>
         </w:tc>
@@ -978,21 +899,7 @@
               <w:rPr>
                 <w:rFonts w:ascii="Aptos" w:eastAsia="Aptos" w:hAnsi="Aptos" w:cs="Aptos"/>
               </w:rPr>
-              <w:t xml:space="preserve">Using tools such as Google Analytics and </w:t>
-            </w:r>
-            <w:proofErr w:type="spellStart"/>
-            <w:r>
-              <w:rPr>
-                <w:rFonts w:ascii="Aptos" w:eastAsia="Aptos" w:hAnsi="Aptos" w:cs="Aptos"/>
-              </w:rPr>
-              <w:t>Ahrefs</w:t>
-            </w:r>
-            <w:proofErr w:type="spellEnd"/>
-            <w:r>
-              <w:rPr>
-                <w:rFonts w:ascii="Aptos" w:eastAsia="Aptos" w:hAnsi="Aptos" w:cs="Aptos"/>
-              </w:rPr>
-              <w:t xml:space="preserve"> to measure metrics before the implementation of the recommendation and after. These tools measure the businesses' websites backlinks as well as website authority.</w:t>
+              <w:t>Using tools such as Google Analytics and Ahrefs to measure metrics before the implementation of the recommendation and after. These tools measure the businesses' websites backlinks as well as website authority.</w:t>
             </w:r>
           </w:p>
         </w:tc>
@@ -1186,49 +1093,7 @@
               <w:rPr>
                 <w:rFonts w:ascii="Aptos" w:eastAsia="Aptos" w:hAnsi="Aptos" w:cs="Aptos"/>
               </w:rPr>
-              <w:t xml:space="preserve">This means the Authority Manager AI agent should understand how </w:t>
-            </w:r>
-            <w:proofErr w:type="spellStart"/>
-            <w:r>
-              <w:rPr>
-                <w:rFonts w:ascii="Aptos" w:eastAsia="Aptos" w:hAnsi="Aptos" w:cs="Aptos"/>
-              </w:rPr>
-              <w:t>ViriVR</w:t>
-            </w:r>
-            <w:proofErr w:type="spellEnd"/>
-            <w:r>
-              <w:rPr>
-                <w:rFonts w:ascii="Aptos" w:eastAsia="Aptos" w:hAnsi="Aptos" w:cs="Aptos"/>
-              </w:rPr>
-              <w:t xml:space="preserve"> will present itself to others and determine whether the outputs from its three agents represent the brand in an appropriate, consistent and trustworthy manner. It shouldn't make unverifiable claims and represent </w:t>
-            </w:r>
-            <w:proofErr w:type="spellStart"/>
-            <w:r>
-              <w:rPr>
-                <w:rFonts w:ascii="Aptos" w:eastAsia="Aptos" w:hAnsi="Aptos" w:cs="Aptos"/>
-              </w:rPr>
-              <w:t>ViriVR</w:t>
-            </w:r>
-            <w:proofErr w:type="spellEnd"/>
-            <w:r>
-              <w:rPr>
-                <w:rFonts w:ascii="Aptos" w:eastAsia="Aptos" w:hAnsi="Aptos" w:cs="Aptos"/>
-              </w:rPr>
-              <w:t xml:space="preserve"> in an unprofessional manner that could damage the brand or credibility of the business. Instead, it should make sure the outputs look in a professional that meets </w:t>
-            </w:r>
-            <w:proofErr w:type="spellStart"/>
-            <w:r>
-              <w:rPr>
-                <w:rFonts w:ascii="Aptos" w:eastAsia="Aptos" w:hAnsi="Aptos" w:cs="Aptos"/>
-              </w:rPr>
-              <w:t>ViriVR’s</w:t>
-            </w:r>
-            <w:proofErr w:type="spellEnd"/>
-            <w:r>
-              <w:rPr>
-                <w:rFonts w:ascii="Aptos" w:eastAsia="Aptos" w:hAnsi="Aptos" w:cs="Aptos"/>
-              </w:rPr>
-              <w:t xml:space="preserve"> requirements, expectations and are targets the business’s intended audience</w:t>
+              <w:t>This means the Authority Manager AI agent should understand how ViriVR will present itself to others and determine whether the outputs from its three agents represent the brand in an appropriate, consistent and trustworthy manner. It shouldn't make unverifiable claims and represent ViriVR in an unprofessional manner that could damage the brand or credibility of the business. Instead, it should make sure the outputs look in a professional that meets ViriVR’s requirements, expectations and are targets the business’s intended audience</w:t>
             </w:r>
           </w:p>
         </w:tc>
@@ -1294,43 +1159,7 @@
                 <w:sz w:val="22"/>
                 <w:szCs w:val="22"/>
               </w:rPr>
-              <w:t xml:space="preserve">This one is about ensuring the Authority Manager AI agent should be able capable of reviewing the outputs of its three agents and be able to determine if its completed, relevant, credible and suitable for </w:t>
-            </w:r>
-            <w:proofErr w:type="spellStart"/>
-            <w:r>
-              <w:rPr>
-                <w:rFonts w:ascii="Aptos" w:eastAsia="Aptos" w:hAnsi="Aptos" w:cs="Aptos"/>
-                <w:sz w:val="22"/>
-                <w:szCs w:val="22"/>
-              </w:rPr>
-              <w:t>ViriVR</w:t>
-            </w:r>
-            <w:proofErr w:type="spellEnd"/>
-            <w:r>
-              <w:rPr>
-                <w:rFonts w:ascii="Aptos" w:eastAsia="Aptos" w:hAnsi="Aptos" w:cs="Aptos"/>
-                <w:sz w:val="22"/>
-                <w:szCs w:val="22"/>
-              </w:rPr>
-              <w:t xml:space="preserve"> to use. It should be able to identify weak, unverifiable or unsourced claims and opinions, that have weak brand authority, as well as factual inaccuracies and contradictions being displayed or presented as verified facts. Finally, the AI agent would need the capability to evaluate whether outputs meet the standards and requirements of </w:t>
-            </w:r>
-            <w:proofErr w:type="spellStart"/>
-            <w:r>
-              <w:rPr>
-                <w:rFonts w:ascii="Aptos" w:eastAsia="Aptos" w:hAnsi="Aptos" w:cs="Aptos"/>
-                <w:sz w:val="22"/>
-                <w:szCs w:val="22"/>
-              </w:rPr>
-              <w:t>ViriVR</w:t>
-            </w:r>
-            <w:proofErr w:type="spellEnd"/>
-            <w:r>
-              <w:rPr>
-                <w:rFonts w:ascii="Aptos" w:eastAsia="Aptos" w:hAnsi="Aptos" w:cs="Aptos"/>
-                <w:sz w:val="22"/>
-                <w:szCs w:val="22"/>
-              </w:rPr>
-              <w:t>.</w:t>
+              <w:t>This one is about ensuring the Authority Manager AI agent should be able capable of reviewing the outputs of its three agents and be able to determine if its completed, relevant, credible and suitable for ViriVR to use. It should be able to identify weak, unverifiable or unsourced claims and opinions, that have weak brand authority, as well as factual inaccuracies and contradictions being displayed or presented as verified facts. Finally, the AI agent would need the capability to evaluate whether outputs meet the standards and requirements of ViriVR.</w:t>
             </w:r>
           </w:p>
         </w:tc>
@@ -1639,21 +1468,12 @@
               </w:rPr>
               <w:t xml:space="preserve">The Authority Manager must understand </w:t>
             </w:r>
-            <w:proofErr w:type="spellStart"/>
             <w:r>
               <w:rPr>
                 <w:rFonts w:ascii="Aptos" w:eastAsia="Aptos" w:hAnsi="Aptos" w:cs="Aptos"/>
                 <w:color w:val="000000" w:themeColor="text1"/>
               </w:rPr>
-              <w:t>ViriVR’s</w:t>
-            </w:r>
-            <w:proofErr w:type="spellEnd"/>
-            <w:r>
-              <w:rPr>
-                <w:rFonts w:ascii="Aptos" w:eastAsia="Aptos" w:hAnsi="Aptos" w:cs="Aptos"/>
-                <w:color w:val="000000" w:themeColor="text1"/>
-              </w:rPr>
-              <w:t xml:space="preserve"> </w:t>
+              <w:t xml:space="preserve">ViriVR’s </w:t>
             </w:r>
             <w:r>
               <w:rPr>
@@ -2168,9 +1988,11 @@
           <w:szCs w:val="22"/>
           <w:lang w:val="en-AU"/>
         </w:rPr>
-        <w:t xml:space="preserve">Relevance: Is the content appropriate for the intended audience and </w:t>
-      </w:r>
-      <w:proofErr w:type="spellStart"/>
+        <w:t xml:space="preserve">Relevance: Is the content appropriate for the intended audience and ViriVR's business goals and objectives? </w:t>
+      </w:r>
+      <w:r>
+        <w:br/>
+      </w:r>
       <w:r>
         <w:rPr>
           <w:rFonts w:ascii="Aptos" w:eastAsia="Aptos" w:hAnsi="Aptos" w:cs="Aptos"/>
@@ -2178,9 +2000,11 @@
           <w:szCs w:val="22"/>
           <w:lang w:val="en-AU"/>
         </w:rPr>
-        <w:t>ViriVR's</w:t>
-      </w:r>
-      <w:proofErr w:type="spellEnd"/>
+        <w:t xml:space="preserve">Consistency: Is the information, wording and presentation consistent with approved sources, brand requirements and related website content? </w:t>
+      </w:r>
+      <w:r>
+        <w:br/>
+      </w:r>
       <w:r>
         <w:rPr>
           <w:rFonts w:ascii="Aptos" w:eastAsia="Aptos" w:hAnsi="Aptos" w:cs="Aptos"/>
@@ -2188,7 +2012,7 @@
           <w:szCs w:val="22"/>
           <w:lang w:val="en-AU"/>
         </w:rPr>
-        <w:t xml:space="preserve"> business goals and objectives? </w:t>
+        <w:t xml:space="preserve">Safety: Does the content avoid misleading, harmful or inappropriate claims, language or presentation that could create risk for ViriVR? </w:t>
       </w:r>
       <w:r>
         <w:br/>
@@ -2200,7 +2024,30 @@
           <w:szCs w:val="22"/>
           <w:lang w:val="en-AU"/>
         </w:rPr>
-        <w:t xml:space="preserve">Consistency: Is the information, wording and presentation consistent with approved sources, brand requirements and related website content? </w:t>
+        <w:t>Any issues or failings of these quality gates should be documented.</w:t>
+      </w:r>
+    </w:p>
+    <w:p>
+      <w:pPr>
+        <w:spacing w:line="257" w:lineRule="auto"/>
+      </w:pPr>
+      <w:r>
+        <w:rPr>
+          <w:rFonts w:ascii="Aptos" w:eastAsia="Aptos" w:hAnsi="Aptos" w:cs="Aptos"/>
+          <w:b/>
+          <w:bCs/>
+          <w:sz w:val="22"/>
+          <w:szCs w:val="22"/>
+        </w:rPr>
+        <w:t>Step 5:</w:t>
+      </w:r>
+      <w:r>
+        <w:rPr>
+          <w:rFonts w:ascii="Aptos" w:eastAsia="Aptos" w:hAnsi="Aptos" w:cs="Aptos"/>
+          <w:sz w:val="22"/>
+          <w:szCs w:val="22"/>
+        </w:rPr>
+        <w:t xml:space="preserve"> Identify strengths, weaknesses and issues with the content. </w:t>
       </w:r>
       <w:r>
         <w:br/>
@@ -2212,9 +2059,42 @@
           <w:szCs w:val="22"/>
           <w:lang w:val="en-AU"/>
         </w:rPr>
-        <w:t xml:space="preserve">Safety: Does the content avoid misleading, harmful or inappropriate claims, language or presentation that could create risk for </w:t>
-      </w:r>
-      <w:proofErr w:type="spellStart"/>
+        <w:t>Strengths could include; topic relevance, strong and accurate evidence, useful information, a clear explanation of services, appropriate audience targeting, relevant keyword and topic coverage, content with potential to attract citations or links, and alignment with ViriVR's brand positioning.</w:t>
+      </w:r>
+      <w:r>
+        <w:rPr>
+          <w:rFonts w:ascii="Aptos" w:eastAsia="Aptos" w:hAnsi="Aptos" w:cs="Aptos"/>
+          <w:sz w:val="22"/>
+          <w:szCs w:val="22"/>
+        </w:rPr>
+        <w:t xml:space="preserve"> </w:t>
+      </w:r>
+      <w:r>
+        <w:br/>
+      </w:r>
+      <w:r>
+        <w:rPr>
+          <w:rFonts w:ascii="Aptos" w:eastAsia="Aptos" w:hAnsi="Aptos" w:cs="Aptos"/>
+          <w:sz w:val="22"/>
+          <w:szCs w:val="22"/>
+        </w:rPr>
+        <w:t xml:space="preserve">Weaknesses could include; off topic relevancy or targeting wrong audience, weak or unsupported evidence and claims, inconsistence wording and language, poor structure or presentation, limited authority signals, and misleading the brands representation and goals. </w:t>
+      </w:r>
+    </w:p>
+    <w:p>
+      <w:pPr>
+        <w:spacing w:line="257" w:lineRule="auto"/>
+      </w:pPr>
+      <w:r>
+        <w:rPr>
+          <w:rFonts w:ascii="Aptos" w:eastAsia="Aptos" w:hAnsi="Aptos" w:cs="Aptos"/>
+          <w:b/>
+          <w:bCs/>
+          <w:sz w:val="22"/>
+          <w:szCs w:val="22"/>
+        </w:rPr>
+        <w:t xml:space="preserve">Step 6: </w:t>
+      </w:r>
       <w:r>
         <w:rPr>
           <w:rFonts w:ascii="Aptos" w:eastAsia="Aptos" w:hAnsi="Aptos" w:cs="Aptos"/>
@@ -2222,9 +2102,31 @@
           <w:szCs w:val="22"/>
           <w:lang w:val="en-AU"/>
         </w:rPr>
-        <w:t>ViriVR</w:t>
-      </w:r>
-      <w:proofErr w:type="spellEnd"/>
+        <w:t>Identify how the content may positively or negatively impact ViriVR's SEO, search visibility, topic relevance, external trust or credibility, citations, links and backlinks and brand authority. It should explain the potential impact without inventing or guaranteeing SEO results that cannot be supported by evidence.</w:t>
+      </w:r>
+    </w:p>
+    <w:p>
+      <w:pPr>
+        <w:spacing w:line="257" w:lineRule="auto"/>
+      </w:pPr>
+      <w:r>
+        <w:rPr>
+          <w:rFonts w:ascii="Aptos" w:eastAsia="Aptos" w:hAnsi="Aptos" w:cs="Aptos"/>
+          <w:b/>
+          <w:bCs/>
+          <w:sz w:val="22"/>
+          <w:szCs w:val="22"/>
+        </w:rPr>
+        <w:t>Step 7:</w:t>
+      </w:r>
+      <w:r>
+        <w:rPr>
+          <w:rFonts w:ascii="Aptos" w:eastAsia="Aptos" w:hAnsi="Aptos" w:cs="Aptos"/>
+          <w:sz w:val="22"/>
+          <w:szCs w:val="22"/>
+        </w:rPr>
+        <w:t xml:space="preserve"> </w:t>
+      </w:r>
       <w:r>
         <w:rPr>
           <w:rFonts w:ascii="Aptos" w:eastAsia="Aptos" w:hAnsi="Aptos" w:cs="Aptos"/>
@@ -2232,7 +2134,43 @@
           <w:szCs w:val="22"/>
           <w:lang w:val="en-AU"/>
         </w:rPr>
-        <w:t xml:space="preserve">? </w:t>
+        <w:t>Check whether the content represents ViriVR's brand accurately, appropriately and professionally in accordance with approved brand guidelines and business requirements. This includes checking whether the content correctly describes ViriVR and its services, targets the appropriate audiences, avoids misleading or unverifiable claims or assumptions, and does not use wording, messaging or visuals that could damage the trust, credibility or reputation of the business.</w:t>
+      </w:r>
+      <w:r>
+        <w:rPr>
+          <w:rFonts w:ascii="Aptos" w:eastAsia="Aptos" w:hAnsi="Aptos" w:cs="Aptos"/>
+          <w:sz w:val="22"/>
+          <w:szCs w:val="22"/>
+        </w:rPr>
+        <w:t xml:space="preserve"> </w:t>
+      </w:r>
+    </w:p>
+    <w:p>
+      <w:pPr>
+        <w:spacing w:line="257" w:lineRule="auto"/>
+        <w:rPr>
+          <w:rFonts w:ascii="Aptos" w:eastAsia="Aptos" w:hAnsi="Aptos" w:cs="Aptos"/>
+          <w:sz w:val="22"/>
+          <w:szCs w:val="22"/>
+        </w:rPr>
+      </w:pPr>
+      <w:r>
+        <w:rPr>
+          <w:rFonts w:ascii="Aptos" w:eastAsia="Aptos" w:hAnsi="Aptos" w:cs="Aptos"/>
+          <w:b/>
+          <w:bCs/>
+          <w:sz w:val="22"/>
+          <w:szCs w:val="22"/>
+        </w:rPr>
+        <w:t>Step 8:</w:t>
+      </w:r>
+      <w:r>
+        <w:rPr>
+          <w:rFonts w:ascii="Aptos" w:eastAsia="Aptos" w:hAnsi="Aptos" w:cs="Aptos"/>
+          <w:sz w:val="22"/>
+          <w:szCs w:val="22"/>
+        </w:rPr>
+        <w:t xml:space="preserve"> Identify any of the findings from this audit that could require further work or analysis from one or more of the specialist agents. Until the specialist agents are operational, these findings should be marked as requiring specialist review rather than see as a completed specialist analysis. The findings may be flagged for future review by the specialist ai agents, which cover the following:</w:t>
       </w:r>
       <w:r>
         <w:br/>
@@ -2240,11 +2178,62 @@
       <w:r>
         <w:rPr>
           <w:rFonts w:ascii="Aptos" w:eastAsia="Aptos" w:hAnsi="Aptos" w:cs="Aptos"/>
-          <w:sz w:val="22"/>
-          <w:szCs w:val="22"/>
-          <w:lang w:val="en-AU"/>
-        </w:rPr>
-        <w:t>Any issues or failings of these quality gates should be documented.</w:t>
+          <w:b/>
+          <w:bCs/>
+          <w:sz w:val="22"/>
+          <w:szCs w:val="22"/>
+        </w:rPr>
+        <w:t>Digital PR Specialist required:</w:t>
+      </w:r>
+      <w:r>
+        <w:rPr>
+          <w:rFonts w:ascii="Aptos" w:eastAsia="Aptos" w:hAnsi="Aptos" w:cs="Aptos"/>
+          <w:sz w:val="22"/>
+          <w:szCs w:val="22"/>
+        </w:rPr>
+        <w:t xml:space="preserve"> PR opportunities, external coverage, visibility and outreach</w:t>
+      </w:r>
+      <w:r>
+        <w:br/>
+      </w:r>
+      <w:r>
+        <w:rPr>
+          <w:rFonts w:ascii="Aptos" w:eastAsia="Aptos" w:hAnsi="Aptos" w:cs="Aptos"/>
+          <w:b/>
+          <w:bCs/>
+          <w:sz w:val="22"/>
+          <w:szCs w:val="22"/>
+        </w:rPr>
+        <w:t xml:space="preserve">Backlink Auditor required: </w:t>
+      </w:r>
+      <w:r>
+        <w:rPr>
+          <w:rFonts w:ascii="Aptos" w:eastAsia="Aptos" w:hAnsi="Aptos" w:cs="Aptos"/>
+          <w:sz w:val="22"/>
+          <w:szCs w:val="22"/>
+        </w:rPr>
+        <w:t>Quality of links and backlinks, link opportunities and referring domains</w:t>
+      </w:r>
+      <w:r>
+        <w:br/>
+      </w:r>
+      <w:r>
+        <w:rPr>
+          <w:rFonts w:ascii="Aptos" w:eastAsia="Aptos" w:hAnsi="Aptos" w:cs="Aptos"/>
+          <w:b/>
+          <w:bCs/>
+          <w:sz w:val="22"/>
+          <w:szCs w:val="22"/>
+        </w:rPr>
+        <w:t>Brand Authority Builder required:</w:t>
+      </w:r>
+      <w:r>
+        <w:rPr>
+          <w:rFonts w:ascii="Aptos" w:eastAsia="Aptos" w:hAnsi="Aptos" w:cs="Aptos"/>
+          <w:sz w:val="22"/>
+          <w:szCs w:val="22"/>
+        </w:rPr>
+        <w:t xml:space="preserve"> authority gaps, citations, trust signals and brand-presence opportunities</w:t>
       </w:r>
     </w:p>
     <w:p>
@@ -2259,295 +2248,6 @@
           <w:sz w:val="22"/>
           <w:szCs w:val="22"/>
         </w:rPr>
-        <w:t>Step 5:</w:t>
-      </w:r>
-      <w:r>
-        <w:rPr>
-          <w:rFonts w:ascii="Aptos" w:eastAsia="Aptos" w:hAnsi="Aptos" w:cs="Aptos"/>
-          <w:sz w:val="22"/>
-          <w:szCs w:val="22"/>
-        </w:rPr>
-        <w:t xml:space="preserve"> Identify strengths, weaknesses and issues with the content. </w:t>
-      </w:r>
-      <w:r>
-        <w:br/>
-      </w:r>
-      <w:r>
-        <w:rPr>
-          <w:rFonts w:ascii="Aptos" w:eastAsia="Aptos" w:hAnsi="Aptos" w:cs="Aptos"/>
-          <w:sz w:val="22"/>
-          <w:szCs w:val="22"/>
-          <w:lang w:val="en-AU"/>
-        </w:rPr>
-        <w:t xml:space="preserve">Strengths could include; topic relevance, strong and accurate evidence, useful information, a clear explanation of services, appropriate audience targeting, relevant keyword and topic coverage, content with potential to attract citations or links, and alignment with </w:t>
-      </w:r>
-      <w:proofErr w:type="spellStart"/>
-      <w:r>
-        <w:rPr>
-          <w:rFonts w:ascii="Aptos" w:eastAsia="Aptos" w:hAnsi="Aptos" w:cs="Aptos"/>
-          <w:sz w:val="22"/>
-          <w:szCs w:val="22"/>
-          <w:lang w:val="en-AU"/>
-        </w:rPr>
-        <w:t>ViriVR's</w:t>
-      </w:r>
-      <w:proofErr w:type="spellEnd"/>
-      <w:r>
-        <w:rPr>
-          <w:rFonts w:ascii="Aptos" w:eastAsia="Aptos" w:hAnsi="Aptos" w:cs="Aptos"/>
-          <w:sz w:val="22"/>
-          <w:szCs w:val="22"/>
-          <w:lang w:val="en-AU"/>
-        </w:rPr>
-        <w:t xml:space="preserve"> brand positioning.</w:t>
-      </w:r>
-      <w:r>
-        <w:rPr>
-          <w:rFonts w:ascii="Aptos" w:eastAsia="Aptos" w:hAnsi="Aptos" w:cs="Aptos"/>
-          <w:sz w:val="22"/>
-          <w:szCs w:val="22"/>
-        </w:rPr>
-        <w:t xml:space="preserve"> </w:t>
-      </w:r>
-      <w:r>
-        <w:br/>
-      </w:r>
-      <w:r>
-        <w:rPr>
-          <w:rFonts w:ascii="Aptos" w:eastAsia="Aptos" w:hAnsi="Aptos" w:cs="Aptos"/>
-          <w:sz w:val="22"/>
-          <w:szCs w:val="22"/>
-        </w:rPr>
-        <w:t xml:space="preserve">Weaknesses could include; off topic relevancy or targeting wrong audience, weak or unsupported evidence and claims, inconsistence wording and language, poor structure or presentation, limited authority signals, and misleading the brands representation and goals. </w:t>
-      </w:r>
-    </w:p>
-    <w:p>
-      <w:pPr>
-        <w:spacing w:line="257" w:lineRule="auto"/>
-      </w:pPr>
-      <w:r>
-        <w:rPr>
-          <w:rFonts w:ascii="Aptos" w:eastAsia="Aptos" w:hAnsi="Aptos" w:cs="Aptos"/>
-          <w:b/>
-          <w:bCs/>
-          <w:sz w:val="22"/>
-          <w:szCs w:val="22"/>
-        </w:rPr>
-        <w:t xml:space="preserve">Step 6: </w:t>
-      </w:r>
-      <w:r>
-        <w:rPr>
-          <w:rFonts w:ascii="Aptos" w:eastAsia="Aptos" w:hAnsi="Aptos" w:cs="Aptos"/>
-          <w:sz w:val="22"/>
-          <w:szCs w:val="22"/>
-          <w:lang w:val="en-AU"/>
-        </w:rPr>
-        <w:t xml:space="preserve">Identify how the content may positively or negatively impact </w:t>
-      </w:r>
-      <w:proofErr w:type="spellStart"/>
-      <w:r>
-        <w:rPr>
-          <w:rFonts w:ascii="Aptos" w:eastAsia="Aptos" w:hAnsi="Aptos" w:cs="Aptos"/>
-          <w:sz w:val="22"/>
-          <w:szCs w:val="22"/>
-          <w:lang w:val="en-AU"/>
-        </w:rPr>
-        <w:t>ViriVR's</w:t>
-      </w:r>
-      <w:proofErr w:type="spellEnd"/>
-      <w:r>
-        <w:rPr>
-          <w:rFonts w:ascii="Aptos" w:eastAsia="Aptos" w:hAnsi="Aptos" w:cs="Aptos"/>
-          <w:sz w:val="22"/>
-          <w:szCs w:val="22"/>
-          <w:lang w:val="en-AU"/>
-        </w:rPr>
-        <w:t xml:space="preserve"> SEO, search visibility, topic relevance, external trust or credibility, citations, links and backlinks and brand authority. It should explain the potential impact without inventing or guaranteeing SEO results that cannot be supported by evidence.</w:t>
-      </w:r>
-    </w:p>
-    <w:p>
-      <w:pPr>
-        <w:spacing w:line="257" w:lineRule="auto"/>
-      </w:pPr>
-      <w:r>
-        <w:rPr>
-          <w:rFonts w:ascii="Aptos" w:eastAsia="Aptos" w:hAnsi="Aptos" w:cs="Aptos"/>
-          <w:b/>
-          <w:bCs/>
-          <w:sz w:val="22"/>
-          <w:szCs w:val="22"/>
-        </w:rPr>
-        <w:t>Step 7:</w:t>
-      </w:r>
-      <w:r>
-        <w:rPr>
-          <w:rFonts w:ascii="Aptos" w:eastAsia="Aptos" w:hAnsi="Aptos" w:cs="Aptos"/>
-          <w:sz w:val="22"/>
-          <w:szCs w:val="22"/>
-        </w:rPr>
-        <w:t xml:space="preserve"> </w:t>
-      </w:r>
-      <w:r>
-        <w:rPr>
-          <w:rFonts w:ascii="Aptos" w:eastAsia="Aptos" w:hAnsi="Aptos" w:cs="Aptos"/>
-          <w:sz w:val="22"/>
-          <w:szCs w:val="22"/>
-          <w:lang w:val="en-AU"/>
-        </w:rPr>
-        <w:t xml:space="preserve">Check whether the content represents </w:t>
-      </w:r>
-      <w:proofErr w:type="spellStart"/>
-      <w:r>
-        <w:rPr>
-          <w:rFonts w:ascii="Aptos" w:eastAsia="Aptos" w:hAnsi="Aptos" w:cs="Aptos"/>
-          <w:sz w:val="22"/>
-          <w:szCs w:val="22"/>
-          <w:lang w:val="en-AU"/>
-        </w:rPr>
-        <w:t>ViriVR's</w:t>
-      </w:r>
-      <w:proofErr w:type="spellEnd"/>
-      <w:r>
-        <w:rPr>
-          <w:rFonts w:ascii="Aptos" w:eastAsia="Aptos" w:hAnsi="Aptos" w:cs="Aptos"/>
-          <w:sz w:val="22"/>
-          <w:szCs w:val="22"/>
-          <w:lang w:val="en-AU"/>
-        </w:rPr>
-        <w:t xml:space="preserve"> brand accurately, appropriately and professionally in accordance with approved brand guidelines and business requirements. This includes checking whether the content correctly describes </w:t>
-      </w:r>
-      <w:proofErr w:type="spellStart"/>
-      <w:r>
-        <w:rPr>
-          <w:rFonts w:ascii="Aptos" w:eastAsia="Aptos" w:hAnsi="Aptos" w:cs="Aptos"/>
-          <w:sz w:val="22"/>
-          <w:szCs w:val="22"/>
-          <w:lang w:val="en-AU"/>
-        </w:rPr>
-        <w:t>ViriVR</w:t>
-      </w:r>
-      <w:proofErr w:type="spellEnd"/>
-      <w:r>
-        <w:rPr>
-          <w:rFonts w:ascii="Aptos" w:eastAsia="Aptos" w:hAnsi="Aptos" w:cs="Aptos"/>
-          <w:sz w:val="22"/>
-          <w:szCs w:val="22"/>
-          <w:lang w:val="en-AU"/>
-        </w:rPr>
-        <w:t xml:space="preserve"> and its services, targets the appropriate audiences, avoids misleading or unverifiable claims or assumptions, and does not use wording, messaging or visuals that could damage the trust, credibility or reputation of the business.</w:t>
-      </w:r>
-      <w:r>
-        <w:rPr>
-          <w:rFonts w:ascii="Aptos" w:eastAsia="Aptos" w:hAnsi="Aptos" w:cs="Aptos"/>
-          <w:sz w:val="22"/>
-          <w:szCs w:val="22"/>
-        </w:rPr>
-        <w:t xml:space="preserve"> </w:t>
-      </w:r>
-    </w:p>
-    <w:p>
-      <w:pPr>
-        <w:spacing w:line="257" w:lineRule="auto"/>
-        <w:rPr>
-          <w:rFonts w:ascii="Aptos" w:eastAsia="Aptos" w:hAnsi="Aptos" w:cs="Aptos"/>
-          <w:sz w:val="22"/>
-          <w:szCs w:val="22"/>
-        </w:rPr>
-      </w:pPr>
-      <w:r>
-        <w:rPr>
-          <w:rFonts w:ascii="Aptos" w:eastAsia="Aptos" w:hAnsi="Aptos" w:cs="Aptos"/>
-          <w:b/>
-          <w:bCs/>
-          <w:sz w:val="22"/>
-          <w:szCs w:val="22"/>
-        </w:rPr>
-        <w:t>Step 8:</w:t>
-      </w:r>
-      <w:r>
-        <w:rPr>
-          <w:rFonts w:ascii="Aptos" w:eastAsia="Aptos" w:hAnsi="Aptos" w:cs="Aptos"/>
-          <w:sz w:val="22"/>
-          <w:szCs w:val="22"/>
-        </w:rPr>
-        <w:t xml:space="preserve"> Identify any of the findings from this audit that could require further work or analysis from one or more of the specialist agents. Until the specialist agents are operational, these findings should be marked as requiring specialist review rather than see as a completed specialist analysis. The findings may be flagged for future review by the specialist ai agents, which cover the following:</w:t>
-      </w:r>
-      <w:r>
-        <w:br/>
-      </w:r>
-      <w:r>
-        <w:rPr>
-          <w:rFonts w:ascii="Aptos" w:eastAsia="Aptos" w:hAnsi="Aptos" w:cs="Aptos"/>
-          <w:b/>
-          <w:bCs/>
-          <w:sz w:val="22"/>
-          <w:szCs w:val="22"/>
-        </w:rPr>
-        <w:t>Digital PR Specialist required:</w:t>
-      </w:r>
-      <w:r>
-        <w:rPr>
-          <w:rFonts w:ascii="Aptos" w:eastAsia="Aptos" w:hAnsi="Aptos" w:cs="Aptos"/>
-          <w:sz w:val="22"/>
-          <w:szCs w:val="22"/>
-        </w:rPr>
-        <w:t xml:space="preserve"> PR opportunities, external coverage, visibility and outreach</w:t>
-      </w:r>
-      <w:r>
-        <w:br/>
-      </w:r>
-      <w:r>
-        <w:rPr>
-          <w:rFonts w:ascii="Aptos" w:eastAsia="Aptos" w:hAnsi="Aptos" w:cs="Aptos"/>
-          <w:b/>
-          <w:bCs/>
-          <w:sz w:val="22"/>
-          <w:szCs w:val="22"/>
-        </w:rPr>
-        <w:t xml:space="preserve">Backlink Auditor required: </w:t>
-      </w:r>
-      <w:r>
-        <w:rPr>
-          <w:rFonts w:ascii="Aptos" w:eastAsia="Aptos" w:hAnsi="Aptos" w:cs="Aptos"/>
-          <w:sz w:val="22"/>
-          <w:szCs w:val="22"/>
-        </w:rPr>
-        <w:t>Quality of links and backlinks, link opportunities and referring domains</w:t>
-      </w:r>
-      <w:r>
-        <w:br/>
-      </w:r>
-      <w:r>
-        <w:rPr>
-          <w:rFonts w:ascii="Aptos" w:eastAsia="Aptos" w:hAnsi="Aptos" w:cs="Aptos"/>
-          <w:b/>
-          <w:bCs/>
-          <w:sz w:val="22"/>
-          <w:szCs w:val="22"/>
-        </w:rPr>
-        <w:t>Brand Authority Builder required:</w:t>
-      </w:r>
-      <w:r>
-        <w:rPr>
-          <w:rFonts w:ascii="Aptos" w:eastAsia="Aptos" w:hAnsi="Aptos" w:cs="Aptos"/>
-          <w:sz w:val="22"/>
-          <w:szCs w:val="22"/>
-        </w:rPr>
-        <w:t xml:space="preserve"> authority gaps, citations, trust signals and brand-presence opportunities</w:t>
-      </w:r>
-    </w:p>
-    <w:p>
-      <w:pPr>
-        <w:spacing w:line="257" w:lineRule="auto"/>
-      </w:pPr>
-      <w:r>
-        <w:rPr>
-          <w:rFonts w:ascii="Aptos" w:eastAsia="Aptos" w:hAnsi="Aptos" w:cs="Aptos"/>
-          <w:b/>
-          <w:bCs/>
-          <w:sz w:val="22"/>
-          <w:szCs w:val="22"/>
-        </w:rPr>
         <w:t>Step 9:</w:t>
       </w:r>
       <w:r>
@@ -2556,43 +2256,7 @@
           <w:sz w:val="22"/>
           <w:szCs w:val="22"/>
         </w:rPr>
-        <w:t xml:space="preserve"> Separate and clearly identify; evidence, assumptions, recommendations, unresolved questions and findings that required future specialist review. Sort and </w:t>
-      </w:r>
-      <w:proofErr w:type="spellStart"/>
-      <w:r>
-        <w:rPr>
-          <w:rFonts w:ascii="Aptos" w:eastAsia="Aptos" w:hAnsi="Aptos" w:cs="Aptos"/>
-          <w:sz w:val="22"/>
-          <w:szCs w:val="22"/>
-        </w:rPr>
-        <w:t>priorotise</w:t>
-      </w:r>
-      <w:proofErr w:type="spellEnd"/>
-      <w:r>
-        <w:rPr>
-          <w:rFonts w:ascii="Aptos" w:eastAsia="Aptos" w:hAnsi="Aptos" w:cs="Aptos"/>
-          <w:sz w:val="22"/>
-          <w:szCs w:val="22"/>
-        </w:rPr>
-        <w:t xml:space="preserve"> these findings based on their potential impact, the severity, brand risk and relevance to </w:t>
-      </w:r>
-      <w:proofErr w:type="spellStart"/>
-      <w:r>
-        <w:rPr>
-          <w:rFonts w:ascii="Aptos" w:eastAsia="Aptos" w:hAnsi="Aptos" w:cs="Aptos"/>
-          <w:sz w:val="22"/>
-          <w:szCs w:val="22"/>
-        </w:rPr>
-        <w:t>ViriVR</w:t>
-      </w:r>
-      <w:proofErr w:type="spellEnd"/>
-      <w:r>
-        <w:rPr>
-          <w:rFonts w:ascii="Aptos" w:eastAsia="Aptos" w:hAnsi="Aptos" w:cs="Aptos"/>
-          <w:sz w:val="22"/>
-          <w:szCs w:val="22"/>
-        </w:rPr>
-        <w:t xml:space="preserve">. </w:t>
+        <w:t xml:space="preserve"> Separate and clearly identify; evidence, assumptions, recommendations, unresolved questions and findings that required future specialist review. Sort and priorotise these findings based on their potential impact, the severity, brand risk and relevance to ViriVR. </w:t>
       </w:r>
     </w:p>
     <w:p>
@@ -2736,61 +2400,7 @@
           <w:sz w:val="22"/>
           <w:szCs w:val="22"/>
         </w:rPr>
-        <w:t xml:space="preserve"> </w:t>
-      </w:r>
-      <w:proofErr w:type="spellStart"/>
-      <w:r>
-        <w:rPr>
-          <w:rFonts w:ascii="Aptos" w:eastAsia="Aptos" w:hAnsi="Aptos" w:cs="Aptos"/>
-          <w:sz w:val="22"/>
-          <w:szCs w:val="22"/>
-        </w:rPr>
-        <w:t>Organise</w:t>
-      </w:r>
-      <w:proofErr w:type="spellEnd"/>
-      <w:r>
-        <w:rPr>
-          <w:rFonts w:ascii="Aptos" w:eastAsia="Aptos" w:hAnsi="Aptos" w:cs="Aptos"/>
-          <w:sz w:val="22"/>
-          <w:szCs w:val="22"/>
-        </w:rPr>
-        <w:t xml:space="preserve"> and </w:t>
-      </w:r>
-      <w:proofErr w:type="spellStart"/>
-      <w:r>
-        <w:rPr>
-          <w:rFonts w:ascii="Aptos" w:eastAsia="Aptos" w:hAnsi="Aptos" w:cs="Aptos"/>
-          <w:sz w:val="22"/>
-          <w:szCs w:val="22"/>
-        </w:rPr>
-        <w:t>categorise</w:t>
-      </w:r>
-      <w:proofErr w:type="spellEnd"/>
-      <w:r>
-        <w:rPr>
-          <w:rFonts w:ascii="Aptos" w:eastAsia="Aptos" w:hAnsi="Aptos" w:cs="Aptos"/>
-          <w:sz w:val="22"/>
-          <w:szCs w:val="22"/>
-        </w:rPr>
-        <w:t xml:space="preserve"> the findings based on their relevance, potential business impact, authority impact and brand risk to </w:t>
-      </w:r>
-      <w:proofErr w:type="spellStart"/>
-      <w:r>
-        <w:rPr>
-          <w:rFonts w:ascii="Aptos" w:eastAsia="Aptos" w:hAnsi="Aptos" w:cs="Aptos"/>
-          <w:sz w:val="22"/>
-          <w:szCs w:val="22"/>
-        </w:rPr>
-        <w:t>ViriVR</w:t>
-      </w:r>
-      <w:proofErr w:type="spellEnd"/>
-      <w:r>
-        <w:rPr>
-          <w:rFonts w:ascii="Aptos" w:eastAsia="Aptos" w:hAnsi="Aptos" w:cs="Aptos"/>
-          <w:sz w:val="22"/>
-          <w:szCs w:val="22"/>
-        </w:rPr>
-        <w:t>.</w:t>
+        <w:t xml:space="preserve"> Organise and categorise the findings based on their relevance, potential business impact, authority impact and brand risk to ViriVR.</w:t>
       </w:r>
     </w:p>
     <w:p>
@@ -3036,39 +2646,7 @@
           <w:rFonts w:ascii="Aptos" w:eastAsia="Aptos" w:hAnsi="Aptos" w:cs="Aptos"/>
           <w:color w:val="000000" w:themeColor="text1"/>
         </w:rPr>
-        <w:t xml:space="preserve"> → After validation, only the approved knowledge, data, examples and instructions are to be </w:t>
-      </w:r>
-      <w:proofErr w:type="spellStart"/>
-      <w:r>
-        <w:rPr>
-          <w:rFonts w:ascii="Aptos" w:eastAsia="Aptos" w:hAnsi="Aptos" w:cs="Aptos"/>
-          <w:color w:val="000000" w:themeColor="text1"/>
-        </w:rPr>
-        <w:t>utilised</w:t>
-      </w:r>
-      <w:proofErr w:type="spellEnd"/>
-      <w:r>
-        <w:rPr>
-          <w:rFonts w:ascii="Aptos" w:eastAsia="Aptos" w:hAnsi="Aptos" w:cs="Aptos"/>
-          <w:color w:val="000000" w:themeColor="text1"/>
-        </w:rPr>
-        <w:t xml:space="preserve"> to perform the task. This will ensure only </w:t>
-      </w:r>
-      <w:proofErr w:type="spellStart"/>
-      <w:r>
-        <w:rPr>
-          <w:rFonts w:ascii="Aptos" w:eastAsia="Aptos" w:hAnsi="Aptos" w:cs="Aptos"/>
-          <w:color w:val="000000" w:themeColor="text1"/>
-        </w:rPr>
-        <w:t>authorised</w:t>
-      </w:r>
-      <w:proofErr w:type="spellEnd"/>
-      <w:r>
-        <w:rPr>
-          <w:rFonts w:ascii="Aptos" w:eastAsia="Aptos" w:hAnsi="Aptos" w:cs="Aptos"/>
-          <w:color w:val="000000" w:themeColor="text1"/>
-        </w:rPr>
-        <w:t xml:space="preserve"> and correct information which will reduce the risk of causing errors and complications.</w:t>
+        <w:t xml:space="preserve"> → After validation, only the approved knowledge, data, examples and instructions are to be utilised to perform the task. This will ensure only authorised and correct information which will reduce the risk of causing errors and complications.</w:t>
       </w:r>
     </w:p>
     <w:p>
@@ -3172,23 +2750,7 @@
           <w:rFonts w:ascii="Aptos" w:eastAsia="Aptos" w:hAnsi="Aptos" w:cs="Aptos"/>
           <w:color w:val="000000" w:themeColor="text1"/>
         </w:rPr>
-        <w:t xml:space="preserve">→ The output will be handed off to the Authority Manager for review and approval. It will also include a record of the information </w:t>
-      </w:r>
-      <w:proofErr w:type="spellStart"/>
-      <w:r>
-        <w:rPr>
-          <w:rFonts w:ascii="Aptos" w:eastAsia="Aptos" w:hAnsi="Aptos" w:cs="Aptos"/>
-          <w:color w:val="000000" w:themeColor="text1"/>
-        </w:rPr>
-        <w:t>utilised</w:t>
-      </w:r>
-      <w:proofErr w:type="spellEnd"/>
-      <w:r>
-        <w:rPr>
-          <w:rFonts w:ascii="Aptos" w:eastAsia="Aptos" w:hAnsi="Aptos" w:cs="Aptos"/>
-          <w:color w:val="000000" w:themeColor="text1"/>
-        </w:rPr>
-        <w:t>, version of information as well as escalation flags that were raised that required the Authority Manager’s approval or attention.</w:t>
+        <w:t>→ The output will be handed off to the Authority Manager for review and approval. It will also include a record of the information utilised, version of information as well as escalation flags that were raised that required the Authority Manager’s approval or attention.</w:t>
       </w:r>
     </w:p>
     <w:p>
@@ -3215,23 +2777,7 @@
           <w:rFonts w:ascii="Aptos" w:eastAsia="Aptos" w:hAnsi="Aptos" w:cs="Aptos"/>
           <w:color w:val="000000" w:themeColor="text1"/>
         </w:rPr>
-        <w:t xml:space="preserve"> → The three AI Agents will coordinate and provide recommendations, business opportunities or strategies that will strengthen the external trust, citations, links, brand awareness and overall digital and domain authority of </w:t>
-      </w:r>
-      <w:proofErr w:type="spellStart"/>
-      <w:r>
-        <w:rPr>
-          <w:rFonts w:ascii="Aptos" w:eastAsia="Aptos" w:hAnsi="Aptos" w:cs="Aptos"/>
-          <w:color w:val="000000" w:themeColor="text1"/>
-        </w:rPr>
-        <w:t>ViriVR</w:t>
-      </w:r>
-      <w:proofErr w:type="spellEnd"/>
-      <w:r>
-        <w:rPr>
-          <w:rFonts w:ascii="Aptos" w:eastAsia="Aptos" w:hAnsi="Aptos" w:cs="Aptos"/>
-          <w:color w:val="000000" w:themeColor="text1"/>
-        </w:rPr>
-        <w:t>.</w:t>
+        <w:t xml:space="preserve"> → The three AI Agents will coordinate and provide recommendations, business opportunities or strategies that will strengthen the external trust, citations, links, brand awareness and overall digital and domain authority of ViriVR.</w:t>
       </w:r>
     </w:p>
     <w:p>
@@ -3424,19 +2970,11 @@
             </w:tcMar>
           </w:tcPr>
           <w:p>
-            <w:proofErr w:type="spellStart"/>
             <w:r>
               <w:rPr>
                 <w:rFonts w:ascii="Aptos" w:eastAsia="Aptos" w:hAnsi="Aptos" w:cs="Aptos"/>
               </w:rPr>
-              <w:t>Utilised</w:t>
-            </w:r>
-            <w:proofErr w:type="spellEnd"/>
-            <w:r>
-              <w:rPr>
-                <w:rFonts w:ascii="Aptos" w:eastAsia="Aptos" w:hAnsi="Aptos" w:cs="Aptos"/>
-              </w:rPr>
-              <w:t xml:space="preserve"> to create, test, and interact with the three AI agents and their respective outputs. </w:t>
+              <w:t xml:space="preserve">Utilised to create, test, and interact with the three AI agents and their respective outputs. </w:t>
             </w:r>
           </w:p>
         </w:tc>
@@ -3482,21 +3020,12 @@
               </w:rPr>
               <w:t xml:space="preserve">Provides metrics on </w:t>
             </w:r>
-            <w:proofErr w:type="spellStart"/>
             <w:r>
               <w:rPr>
                 <w:rFonts w:ascii="Aptos" w:eastAsia="Aptos" w:hAnsi="Aptos" w:cs="Aptos"/>
                 <w:color w:val="000000" w:themeColor="text1"/>
               </w:rPr>
-              <w:t>ViriVR’s</w:t>
-            </w:r>
-            <w:proofErr w:type="spellEnd"/>
-            <w:r>
-              <w:rPr>
-                <w:rFonts w:ascii="Aptos" w:eastAsia="Aptos" w:hAnsi="Aptos" w:cs="Aptos"/>
-                <w:color w:val="000000" w:themeColor="text1"/>
-              </w:rPr>
-              <w:t xml:space="preserve"> </w:t>
+              <w:t xml:space="preserve">ViriVR’s </w:t>
             </w:r>
             <w:r>
               <w:rPr>
@@ -3559,14 +3088,12 @@
             </w:tcMar>
           </w:tcPr>
           <w:p>
-            <w:proofErr w:type="spellStart"/>
             <w:r>
               <w:rPr>
                 <w:rFonts w:ascii="Aptos" w:eastAsia="Aptos" w:hAnsi="Aptos" w:cs="Aptos"/>
               </w:rPr>
               <w:t>Ahrefs</w:t>
             </w:r>
-            <w:proofErr w:type="spellEnd"/>
           </w:p>
         </w:tc>
         <w:tc>
@@ -3582,37 +3109,14 @@
               <w:rPr>
                 <w:rFonts w:ascii="Aptos" w:eastAsia="Aptos" w:hAnsi="Aptos" w:cs="Aptos"/>
               </w:rPr>
-              <w:t xml:space="preserve">Used to </w:t>
+              <w:t xml:space="preserve">Used to analyse and check </w:t>
             </w:r>
-            <w:proofErr w:type="spellStart"/>
             <w:r>
               <w:rPr>
                 <w:rFonts w:ascii="Aptos" w:eastAsia="Aptos" w:hAnsi="Aptos" w:cs="Aptos"/>
-              </w:rPr>
-              <w:t>analyse</w:t>
-            </w:r>
-            <w:proofErr w:type="spellEnd"/>
-            <w:r>
-              <w:rPr>
-                <w:rFonts w:ascii="Aptos" w:eastAsia="Aptos" w:hAnsi="Aptos" w:cs="Aptos"/>
-              </w:rPr>
-              <w:t xml:space="preserve"> and check </w:t>
-            </w:r>
-            <w:proofErr w:type="spellStart"/>
-            <w:r>
-              <w:rPr>
-                <w:rFonts w:ascii="Aptos" w:eastAsia="Aptos" w:hAnsi="Aptos" w:cs="Aptos"/>
                 <w:color w:val="000000" w:themeColor="text1"/>
               </w:rPr>
-              <w:t>ViriVR’s</w:t>
-            </w:r>
-            <w:proofErr w:type="spellEnd"/>
-            <w:r>
-              <w:rPr>
-                <w:rFonts w:ascii="Aptos" w:eastAsia="Aptos" w:hAnsi="Aptos" w:cs="Aptos"/>
-                <w:color w:val="000000" w:themeColor="text1"/>
-              </w:rPr>
-              <w:t xml:space="preserve"> </w:t>
+              <w:t xml:space="preserve">ViriVR’s </w:t>
             </w:r>
             <w:r>
               <w:rPr>
@@ -3692,15 +3196,7 @@
       </w:r>
       <w:r>
         <w:br/>
-        <w:t xml:space="preserve">1. The agent must not create or invent research, facts, evidence, KPI results or any information that hasn’t been verified by approved sources or </w:t>
-      </w:r>
-      <w:proofErr w:type="spellStart"/>
-      <w:r>
-        <w:t>authorised</w:t>
-      </w:r>
-      <w:proofErr w:type="spellEnd"/>
-      <w:r>
-        <w:t xml:space="preserve"> by the human Authority Manager. </w:t>
+        <w:t xml:space="preserve">1. The agent must not create or invent research, facts, evidence, KPI results or any information that hasn’t been verified by approved sources or authorised by the human Authority Manager. </w:t>
       </w:r>
     </w:p>
     <w:p>
@@ -3709,15 +3205,7 @@
         <w:keepLines/>
       </w:pPr>
       <w:r>
-        <w:t xml:space="preserve">2. If there is any information that it doesn't understand or needs clarification, it must identify and outline the complication or issue so it can be given human approval and </w:t>
-      </w:r>
-      <w:proofErr w:type="spellStart"/>
-      <w:r>
-        <w:t>authorisation</w:t>
-      </w:r>
-      <w:proofErr w:type="spellEnd"/>
-      <w:r>
-        <w:t xml:space="preserve">. </w:t>
+        <w:t xml:space="preserve">2. If there is any information that it doesn't understand or needs clarification, it must identify and outline the complication or issue so it can be given human approval and authorisation. </w:t>
       </w:r>
     </w:p>
     <w:p>
@@ -3873,23 +3361,7 @@
           <w:rFonts w:ascii="Aptos" w:eastAsia="Aptos" w:hAnsi="Aptos" w:cs="Aptos"/>
           <w:color w:val="000000" w:themeColor="text1"/>
         </w:rPr>
-        <w:t xml:space="preserve">Source: </w:t>
-      </w:r>
-      <w:proofErr w:type="spellStart"/>
-      <w:r>
-        <w:rPr>
-          <w:rFonts w:ascii="Aptos" w:eastAsia="Aptos" w:hAnsi="Aptos" w:cs="Aptos"/>
-          <w:color w:val="000000" w:themeColor="text1"/>
-        </w:rPr>
-        <w:t>Ratnarajah</w:t>
-      </w:r>
-      <w:proofErr w:type="spellEnd"/>
-      <w:r>
-        <w:rPr>
-          <w:rFonts w:ascii="Aptos" w:eastAsia="Aptos" w:hAnsi="Aptos" w:cs="Aptos"/>
-          <w:color w:val="000000" w:themeColor="text1"/>
-        </w:rPr>
-        <w:t xml:space="preserve">, A (2026) </w:t>
+        <w:t xml:space="preserve">Source: Ratnarajah, A (2026) </w:t>
       </w:r>
       <w:r>
         <w:rPr>
@@ -3900,21 +3372,12 @@
         </w:rPr>
         <w:t xml:space="preserve">Digital Marketing Centre of Excellence Graduate Handbook. </w:t>
       </w:r>
-      <w:proofErr w:type="spellStart"/>
-      <w:r>
-        <w:rPr>
-          <w:rFonts w:ascii="Aptos" w:eastAsia="Aptos" w:hAnsi="Aptos" w:cs="Aptos"/>
-          <w:color w:val="000000" w:themeColor="text1"/>
-        </w:rPr>
-        <w:t>ViriVR</w:t>
-      </w:r>
-      <w:proofErr w:type="spellEnd"/>
-      <w:r>
-        <w:rPr>
-          <w:rFonts w:ascii="Aptos" w:eastAsia="Aptos" w:hAnsi="Aptos" w:cs="Aptos"/>
-          <w:color w:val="000000" w:themeColor="text1"/>
-        </w:rPr>
-        <w:t>.</w:t>
+      <w:r>
+        <w:rPr>
+          <w:rFonts w:ascii="Aptos" w:eastAsia="Aptos" w:hAnsi="Aptos" w:cs="Aptos"/>
+          <w:color w:val="000000" w:themeColor="text1"/>
+        </w:rPr>
+        <w:t>ViriVR.</w:t>
       </w:r>
     </w:p>
     <w:p>
@@ -4326,23 +3789,7 @@
         <w:keepLines/>
       </w:pPr>
       <w:r>
-        <w:t xml:space="preserve">1. Updated and changed naming inconsistency in document. It will now identify the business as </w:t>
-      </w:r>
-      <w:proofErr w:type="spellStart"/>
-      <w:r>
-        <w:t>ViriVR</w:t>
-      </w:r>
-      <w:proofErr w:type="spellEnd"/>
-      <w:r>
-        <w:t xml:space="preserve"> instead of </w:t>
-      </w:r>
-      <w:proofErr w:type="spellStart"/>
-      <w:r>
-        <w:t>ApsisVR</w:t>
-      </w:r>
-      <w:proofErr w:type="spellEnd"/>
-      <w:r>
-        <w:t>.</w:t>
+        <w:t>1. Updated and changed naming inconsistency in document. It will now identify the business as ViriVR instead of ApsisVR.</w:t>
       </w:r>
     </w:p>
     <w:p>
@@ -4501,6 +3948,168 @@
     </w:p>
     <w:p>
       <w:pPr>
+        <w:keepNext/>
+        <w:keepLines/>
+        <w:rPr>
+          <w:b/>
+          <w:bCs/>
+        </w:rPr>
+      </w:pPr>
+      <w:r>
+        <w:rPr>
+          <w:b/>
+          <w:bCs/>
+        </w:rPr>
+        <w:t>Update on 22/09/2026</w:t>
+      </w:r>
+    </w:p>
+    <w:p>
+      <w:pPr>
+        <w:pStyle w:val="ListParagraph"/>
+        <w:keepNext/>
+        <w:keepLines/>
+        <w:numPr>
+          <w:ilvl w:val="0"/>
+          <w:numId w:val="7"/>
+        </w:numPr>
+        <w:rPr>
+          <w:b/>
+          <w:bCs/>
+        </w:rPr>
+      </w:pPr>
+      <w:r>
+        <w:t>Update the Authority Manager’s Pre-Development report workflow, these include:</w:t>
+      </w:r>
+    </w:p>
+    <w:p>
+      <w:pPr>
+        <w:pStyle w:val="ListParagraph"/>
+        <w:keepNext/>
+        <w:keepLines/>
+        <w:numPr>
+          <w:ilvl w:val="1"/>
+          <w:numId w:val="7"/>
+        </w:numPr>
+        <w:rPr>
+          <w:b/>
+          <w:bCs/>
+        </w:rPr>
+      </w:pPr>
+      <w:r>
+        <w:t>Focusing less on long-form analysis and more of an operational handoff package</w:t>
+      </w:r>
+    </w:p>
+    <w:p>
+      <w:pPr>
+        <w:pStyle w:val="ListParagraph"/>
+        <w:keepNext/>
+        <w:keepLines/>
+        <w:numPr>
+          <w:ilvl w:val="1"/>
+          <w:numId w:val="7"/>
+        </w:numPr>
+        <w:rPr>
+          <w:b/>
+          <w:bCs/>
+        </w:rPr>
+      </w:pPr>
+      <w:r>
+        <w:t>Creating a handoff summary at the end of the report</w:t>
+      </w:r>
+    </w:p>
+    <w:p>
+      <w:pPr>
+        <w:pStyle w:val="ListParagraph"/>
+        <w:keepNext/>
+        <w:keepLines/>
+        <w:numPr>
+          <w:ilvl w:val="1"/>
+          <w:numId w:val="7"/>
+        </w:numPr>
+        <w:rPr>
+          <w:b/>
+          <w:bCs/>
+        </w:rPr>
+      </w:pPr>
+      <w:r>
+        <w:t>Creating a claim to evidence table</w:t>
+      </w:r>
+    </w:p>
+    <w:p>
+      <w:pPr>
+        <w:pStyle w:val="ListParagraph"/>
+        <w:keepNext/>
+        <w:keepLines/>
+        <w:numPr>
+          <w:ilvl w:val="1"/>
+          <w:numId w:val="7"/>
+        </w:numPr>
+        <w:rPr>
+          <w:b/>
+          <w:bCs/>
+        </w:rPr>
+      </w:pPr>
+      <w:r>
+        <w:t>Add development readiness status</w:t>
+      </w:r>
+    </w:p>
+    <w:p>
+      <w:pPr>
+        <w:pStyle w:val="ListParagraph"/>
+        <w:keepNext/>
+        <w:keepLines/>
+        <w:numPr>
+          <w:ilvl w:val="1"/>
+          <w:numId w:val="7"/>
+        </w:numPr>
+        <w:rPr>
+          <w:b/>
+          <w:bCs/>
+        </w:rPr>
+      </w:pPr>
+      <w:r>
+        <w:t>Clearer specialist handoff instructions and recommendations</w:t>
+      </w:r>
+    </w:p>
+    <w:p>
+      <w:pPr>
+        <w:pStyle w:val="ListParagraph"/>
+        <w:keepNext/>
+        <w:keepLines/>
+        <w:numPr>
+          <w:ilvl w:val="0"/>
+          <w:numId w:val="7"/>
+        </w:numPr>
+        <w:rPr>
+          <w:b/>
+          <w:bCs/>
+        </w:rPr>
+      </w:pPr>
+      <w:r>
+        <w:t xml:space="preserve">Informed the AI agent to reduce the length of the report, less duplications and repetitions if they’re </w:t>
+      </w:r>
+      <w:r>
+        <w:t>outlined</w:t>
+      </w:r>
+      <w:r>
+        <w:t xml:space="preserve"> in different sections of the report</w:t>
+      </w:r>
+    </w:p>
+    <w:p>
+      <w:pPr>
+        <w:pStyle w:val="ListParagraph"/>
+        <w:keepNext/>
+        <w:keepLines/>
+        <w:ind w:left="1440"/>
+        <w:rPr>
+          <w:b/>
+          <w:bCs/>
+        </w:rPr>
+      </w:pPr>
+    </w:p>
+    <w:p>
+      <w:pPr>
+        <w:pStyle w:val="ListParagraph"/>
         <w:keepNext/>
         <w:keepLines/>
         <w:rPr>
@@ -5181,7 +4790,7 @@
         <w:rFonts w:ascii="Aptos" w:eastAsiaTheme="minorEastAsia" w:hAnsi="Aptos" w:cstheme="minorBidi" w:hint="default"/>
       </w:rPr>
     </w:lvl>
-    <w:lvl w:ilvl="1" w:tplc="0C090003" w:tentative="1">
+    <w:lvl w:ilvl="1" w:tplc="0C090003">
       <w:start w:val="1"/>
       <w:numFmt w:val="bullet"/>
       <w:lvlText w:val="o"/>
@@ -5193,7 +4802,7 @@
         <w:rFonts w:ascii="Courier New" w:hAnsi="Courier New" w:cs="Courier New" w:hint="default"/>
       </w:rPr>
     </w:lvl>
-    <w:lvl w:ilvl="2" w:tplc="0C090005" w:tentative="1">
+    <w:lvl w:ilvl="2" w:tplc="0C090005">
       <w:start w:val="1"/>
       <w:numFmt w:val="bullet"/>
       <w:lvlText w:val=""/>
@@ -6371,6 +5980,12 @@
 </file>
 
 <file path=customXml/item1.xml><?xml version="1.0" encoding="utf-8"?>
+<p:properties xmlns:p="http://schemas.microsoft.com/office/2006/metadata/properties" xmlns:xsi="http://www.w3.org/2001/XMLSchema-instance" xmlns:pc="http://schemas.microsoft.com/office/infopath/2007/PartnerControls">
+  <documentManagement/>
+</p:properties>
+</file>
+
+<file path=customXml/item2.xml><?xml version="1.0" encoding="utf-8"?>
 <ct:contentTypeSchema xmlns:ct="http://schemas.microsoft.com/office/2006/metadata/contentType" xmlns:ma="http://schemas.microsoft.com/office/2006/metadata/properties/metaAttributes" ct:_="" ma:_="" ma:contentTypeName="Document" ma:contentTypeID="0x01010032B022E3FFE7534CAF83618C1EF3FEC2" ma:contentTypeVersion="7" ma:contentTypeDescription="Create a new document." ma:contentTypeScope="" ma:versionID="a897cb37286d26e47733ead3964d5330">
   <xsd:schema xmlns:xsd="http://www.w3.org/2001/XMLSchema" xmlns:xs="http://www.w3.org/2001/XMLSchema" xmlns:p="http://schemas.microsoft.com/office/2006/metadata/properties" xmlns:ns2="01d5e555-494a-40ad-b5bc-1378a5d8ad0d" targetNamespace="http://schemas.microsoft.com/office/2006/metadata/properties" ma:root="true" ma:fieldsID="5cfa18463ebd691bd1329ef9a11c56e8" ns2:_="">
     <xsd:import namespace="01d5e555-494a-40ad-b5bc-1378a5d8ad0d"/>
@@ -6532,12 +6147,6 @@
 </ct:contentTypeSchema>
 </file>
 
-<file path=customXml/item2.xml><?xml version="1.0" encoding="utf-8"?>
-<p:properties xmlns:p="http://schemas.microsoft.com/office/2006/metadata/properties" xmlns:xsi="http://www.w3.org/2001/XMLSchema-instance" xmlns:pc="http://schemas.microsoft.com/office/infopath/2007/PartnerControls">
-  <documentManagement/>
-</p:properties>
-</file>
-
 <file path=customXml/item3.xml><?xml version="1.0" encoding="utf-8"?>
 <?mso-contentType ?>
 <FormTemplates xmlns="http://schemas.microsoft.com/sharepoint/v3/contenttype/forms">
@@ -6548,6 +6157,15 @@
 </file>
 
 <file path=customXml/itemProps1.xml><?xml version="1.0" encoding="utf-8"?>
+<ds:datastoreItem xmlns:ds="http://schemas.openxmlformats.org/officeDocument/2006/customXml" ds:itemID="{C2BDD9E7-F7A9-435B-BDC0-31F82AEEBD6D}">
+  <ds:schemaRefs>
+    <ds:schemaRef ds:uri="http://schemas.microsoft.com/office/2006/metadata/properties"/>
+    <ds:schemaRef ds:uri="http://schemas.microsoft.com/office/infopath/2007/PartnerControls"/>
+  </ds:schemaRefs>
+</ds:datastoreItem>
+</file>
+
+<file path=customXml/itemProps2.xml><?xml version="1.0" encoding="utf-8"?>
 <ds:datastoreItem xmlns:ds="http://schemas.openxmlformats.org/officeDocument/2006/customXml" ds:itemID="{23C5D5E2-8E84-4D20-9A8C-93ACABE40A25}">
   <ds:schemaRefs>
     <ds:schemaRef ds:uri="http://schemas.microsoft.com/office/2006/metadata/contentType"/>
@@ -6565,15 +6183,6 @@
 </ds:datastoreItem>
 </file>
 
-<file path=customXml/itemProps2.xml><?xml version="1.0" encoding="utf-8"?>
-<ds:datastoreItem xmlns:ds="http://schemas.openxmlformats.org/officeDocument/2006/customXml" ds:itemID="{C2BDD9E7-F7A9-435B-BDC0-31F82AEEBD6D}">
-  <ds:schemaRefs>
-    <ds:schemaRef ds:uri="http://schemas.microsoft.com/office/2006/metadata/properties"/>
-    <ds:schemaRef ds:uri="http://schemas.microsoft.com/office/infopath/2007/PartnerControls"/>
-  </ds:schemaRefs>
-</ds:datastoreItem>
-</file>
-
 <file path=customXml/itemProps3.xml><?xml version="1.0" encoding="utf-8"?>
 <ds:datastoreItem xmlns:ds="http://schemas.openxmlformats.org/officeDocument/2006/customXml" ds:itemID="{AEFB4E47-FC17-4A16-B0E3-32CC31B513A4}">
   <ds:schemaRefs>

</xml_diff>